<commit_message>
Change recent files to save in text file instead of registry - v1.4.1
</commit_message>
<xml_diff>
--- a/Docs/ImageR - work notes.docx
+++ b/Docs/ImageR - work notes.docx
@@ -50,6 +50,72 @@
         <w:rPr>
           <w:lang w:val="en-US"/>
         </w:rPr>
+        <w:t>Add recent files support in menus 20/7/21</w:t>
+      </w:r>
+    </w:p>
+    <w:p>
+      <w:pPr>
+        <w:rPr>
+          <w:lang w:val="en-US"/>
+        </w:rPr>
+      </w:pPr>
+      <w:r>
+        <w:rPr>
+          <w:lang w:val="en-US"/>
+        </w:rPr>
+        <w:t>Save the recent files’ list in a text file near the application.</w:t>
+      </w:r>
+    </w:p>
+    <w:p>
+      <w:pPr>
+        <w:rPr>
+          <w:lang w:val="en-US"/>
+        </w:rPr>
+      </w:pPr>
+      <w:r>
+        <w:rPr>
+          <w:lang w:val="en-US"/>
+        </w:rPr>
+        <w:t>It seems to be working – commit version 1.4.1</w:t>
+      </w:r>
+    </w:p>
+    <w:p>
+      <w:pPr>
+        <w:rPr>
+          <w:lang w:val="en-US"/>
+        </w:rPr>
+      </w:pPr>
+      <w:r>
+        <w:rPr>
+          <w:lang w:val="en-US"/>
+        </w:rPr>
+        <w:t>Add different recent files for &lt;File&gt; and &lt;Add&gt; menus</w:t>
+      </w:r>
+      <w:r>
+        <w:rPr>
+          <w:lang w:val="en-US"/>
+        </w:rPr>
+        <w:t xml:space="preserve"> - later</w:t>
+      </w:r>
+    </w:p>
+    <w:p>
+      <w:pPr>
+        <w:rPr>
+          <w:lang w:val="en-US"/>
+        </w:rPr>
+      </w:pPr>
+    </w:p>
+    <w:p>
+      <w:pPr>
+        <w:pStyle w:val="Heading2"/>
+        <w:rPr>
+          <w:lang w:val="en-US"/>
+        </w:rPr>
+      </w:pPr>
+      <w:r>
+        <w:rPr>
+          <w:lang w:val="en-US"/>
+        </w:rPr>
         <w:t>Create Dicom Files with any raster – 17-18/7/21</w:t>
       </w:r>
     </w:p>
@@ -231,25 +297,7 @@
           <w:szCs w:val="18"/>
           <w:lang w:val="en-US"/>
         </w:rPr>
-        <w:t xml:space="preserve">  3 at 00000098:  G 7fe0 N 0010  Len  9439332 L     0x 00 00 bb 03 e6 03 c1 03 </w:t>
-      </w:r>
-      <w:proofErr w:type="spellStart"/>
-      <w:r>
-        <w:rPr>
-          <w:sz w:val="18"/>
-          <w:szCs w:val="18"/>
-          <w:lang w:val="en-US"/>
-        </w:rPr>
-        <w:t>bc</w:t>
-      </w:r>
-      <w:proofErr w:type="spellEnd"/>
-      <w:r>
-        <w:rPr>
-          <w:sz w:val="18"/>
-          <w:szCs w:val="18"/>
-          <w:lang w:val="en-US"/>
-        </w:rPr>
-        <w:t xml:space="preserve"> 03 64 03 93 03 1e 04</w:t>
+        <w:t xml:space="preserve">  3 at 00000098:  G 7fe0 N 0010  Len  9439332 L     0x 00 00 bb 03 e6 03 c1 03 bc 03 64 03 93 03 1e 04</w:t>
       </w:r>
     </w:p>
     <w:p>
@@ -418,6 +466,7 @@
     <w:lsdException w:name="HTML Sample" w:semiHidden="1" w:unhideWhenUsed="1"/>
     <w:lsdException w:name="HTML Typewriter" w:semiHidden="1" w:unhideWhenUsed="1"/>
     <w:lsdException w:name="HTML Variable" w:semiHidden="1" w:unhideWhenUsed="1"/>
+    <w:lsdException w:name="Normal Table" w:semiHidden="1" w:unhideWhenUsed="1"/>
     <w:lsdException w:name="annotation subject" w:semiHidden="1" w:unhideWhenUsed="1"/>
     <w:lsdException w:name="No List" w:semiHidden="1" w:unhideWhenUsed="1"/>
     <w:lsdException w:name="Outline List 1" w:semiHidden="1" w:unhideWhenUsed="1"/>
@@ -464,8 +513,10 @@
     <w:lsdException w:name="Table Subtle 2" w:semiHidden="1" w:unhideWhenUsed="1"/>
     <w:lsdException w:name="Table Web 1" w:semiHidden="1" w:unhideWhenUsed="1"/>
     <w:lsdException w:name="Table Web 2" w:semiHidden="1" w:unhideWhenUsed="1"/>
+    <w:lsdException w:name="Table Web 3" w:semiHidden="1" w:unhideWhenUsed="1"/>
     <w:lsdException w:name="Balloon Text" w:semiHidden="1" w:unhideWhenUsed="1"/>
     <w:lsdException w:name="Table Grid" w:uiPriority="39"/>
+    <w:lsdException w:name="Table Theme" w:semiHidden="1" w:unhideWhenUsed="1"/>
     <w:lsdException w:name="Placeholder Text" w:semiHidden="1"/>
     <w:lsdException w:name="No Spacing" w:uiPriority="1" w:qFormat="1"/>
     <w:lsdException w:name="Light Shading" w:uiPriority="60"/>

</xml_diff>

<commit_message>
Save and restore states for Image Quality Review Application
</commit_message>
<xml_diff>
--- a/Docs/ImageR - work notes.docx
+++ b/Docs/ImageR - work notes.docx
@@ -50,6 +50,46 @@
         <w:rPr>
           <w:lang w:val="en-US"/>
         </w:rPr>
+        <w:t>Adjustment to support client application – 19/10/21</w:t>
+      </w:r>
+    </w:p>
+    <w:p>
+      <w:pPr>
+        <w:rPr>
+          <w:lang w:val="en-US"/>
+        </w:rPr>
+      </w:pPr>
+      <w:r>
+        <w:rPr>
+          <w:lang w:val="en-US"/>
+        </w:rPr>
+        <w:t>Image Quality</w:t>
+      </w:r>
+      <w:r>
+        <w:rPr>
+          <w:lang w:val="en-US"/>
+        </w:rPr>
+        <w:t xml:space="preserve"> Review Application has to save ImageR state to wanted file destination…</w:t>
+      </w:r>
+    </w:p>
+    <w:p>
+      <w:pPr>
+        <w:rPr>
+          <w:lang w:val="en-US"/>
+        </w:rPr>
+      </w:pPr>
+    </w:p>
+    <w:p>
+      <w:pPr>
+        <w:pStyle w:val="Heading2"/>
+        <w:rPr>
+          <w:lang w:val="en-US"/>
+        </w:rPr>
+      </w:pPr>
+      <w:r>
+        <w:rPr>
+          <w:lang w:val="en-US"/>
+        </w:rPr>
         <w:t>Add recent files support in menus 20/7/21</w:t>
       </w:r>
     </w:p>
@@ -261,25 +301,25 @@
           <w:szCs w:val="18"/>
           <w:lang w:val="en-US"/>
         </w:rPr>
-        <w:t xml:space="preserve">  1 at 00000084:  G 0028 N 0010  Len        2 L    s 0x 08</w:t>
-      </w:r>
-    </w:p>
-    <w:p>
-      <w:pPr>
-        <w:spacing w:after="0"/>
+        <w:t xml:space="preserve">  1 at 00000084:  G 0028 N </w:t>
+      </w:r>
+      <w:proofErr w:type="gramStart"/>
+      <w:r>
         <w:rPr>
           <w:sz w:val="18"/>
           <w:szCs w:val="18"/>
           <w:lang w:val="en-US"/>
         </w:rPr>
-      </w:pPr>
+        <w:t>0010  Len</w:t>
+      </w:r>
+      <w:proofErr w:type="gramEnd"/>
       <w:r>
         <w:rPr>
           <w:sz w:val="18"/>
           <w:szCs w:val="18"/>
           <w:lang w:val="en-US"/>
         </w:rPr>
-        <w:t xml:space="preserve">  2 at 0000008e:  G 0028 N 0011  Len        2 L     0x 86 08</w:t>
+        <w:t xml:space="preserve">        2 L    s 0x 08</w:t>
       </w:r>
     </w:p>
     <w:p>
@@ -297,7 +337,79 @@
           <w:szCs w:val="18"/>
           <w:lang w:val="en-US"/>
         </w:rPr>
-        <w:t xml:space="preserve">  3 at 00000098:  G 7fe0 N 0010  Len  9439332 L     0x 00 00 bb 03 e6 03 c1 03 bc 03 64 03 93 03 1e 04</w:t>
+        <w:t xml:space="preserve">  2 at 0000008e:  G 0028 N </w:t>
+      </w:r>
+      <w:proofErr w:type="gramStart"/>
+      <w:r>
+        <w:rPr>
+          <w:sz w:val="18"/>
+          <w:szCs w:val="18"/>
+          <w:lang w:val="en-US"/>
+        </w:rPr>
+        <w:t>0011  Len</w:t>
+      </w:r>
+      <w:proofErr w:type="gramEnd"/>
+      <w:r>
+        <w:rPr>
+          <w:sz w:val="18"/>
+          <w:szCs w:val="18"/>
+          <w:lang w:val="en-US"/>
+        </w:rPr>
+        <w:t xml:space="preserve">        2 L     0x 86 08</w:t>
+      </w:r>
+    </w:p>
+    <w:p>
+      <w:pPr>
+        <w:spacing w:after="0"/>
+        <w:rPr>
+          <w:sz w:val="18"/>
+          <w:szCs w:val="18"/>
+          <w:lang w:val="en-US"/>
+        </w:rPr>
+      </w:pPr>
+      <w:r>
+        <w:rPr>
+          <w:sz w:val="18"/>
+          <w:szCs w:val="18"/>
+          <w:lang w:val="en-US"/>
+        </w:rPr>
+        <w:t xml:space="preserve">  3 at 00000098:  G 7fe0 N </w:t>
+      </w:r>
+      <w:proofErr w:type="gramStart"/>
+      <w:r>
+        <w:rPr>
+          <w:sz w:val="18"/>
+          <w:szCs w:val="18"/>
+          <w:lang w:val="en-US"/>
+        </w:rPr>
+        <w:t>0010  Len</w:t>
+      </w:r>
+      <w:proofErr w:type="gramEnd"/>
+      <w:r>
+        <w:rPr>
+          <w:sz w:val="18"/>
+          <w:szCs w:val="18"/>
+          <w:lang w:val="en-US"/>
+        </w:rPr>
+        <w:t xml:space="preserve">  9439332 L     0x 00 00 bb 03 e6 03 c1 03 </w:t>
+      </w:r>
+      <w:proofErr w:type="spellStart"/>
+      <w:r>
+        <w:rPr>
+          <w:sz w:val="18"/>
+          <w:szCs w:val="18"/>
+          <w:lang w:val="en-US"/>
+        </w:rPr>
+        <w:t>bc</w:t>
+      </w:r>
+      <w:proofErr w:type="spellEnd"/>
+      <w:r>
+        <w:rPr>
+          <w:sz w:val="18"/>
+          <w:szCs w:val="18"/>
+          <w:lang w:val="en-US"/>
+        </w:rPr>
+        <w:t xml:space="preserve"> 03 64 03 93 03 1e 04</w:t>
       </w:r>
     </w:p>
     <w:p>

</xml_diff>

<commit_message>
Support for fast load of Dicom images by using volume
</commit_message>
<xml_diff>
--- a/Docs/ImageR - work notes.docx
+++ b/Docs/ImageR - work notes.docx
@@ -50,6 +50,146 @@
         <w:rPr>
           <w:lang w:val="en-US"/>
         </w:rPr>
+        <w:t>Fast leafing of Dicom files – 30/1/21</w:t>
+      </w:r>
+    </w:p>
+    <w:p>
+      <w:pPr>
+        <w:rPr>
+          <w:lang w:val="en-US"/>
+        </w:rPr>
+      </w:pPr>
+      <w:r>
+        <w:rPr>
+          <w:lang w:val="en-US"/>
+        </w:rPr>
+        <w:t>Add flag in C Meta Data</w:t>
+      </w:r>
+    </w:p>
+    <w:p>
+      <w:pPr>
+        <w:rPr>
+          <w:lang w:val="en-US"/>
+        </w:rPr>
+      </w:pPr>
+      <w:r>
+        <w:rPr>
+          <w:lang w:val="en-US"/>
+        </w:rPr>
+        <w:t>Problem – how to load in the background without stopping regular work…</w:t>
+      </w:r>
+    </w:p>
+    <w:p>
+      <w:pPr>
+        <w:rPr>
+          <w:lang w:val="en-US"/>
+        </w:rPr>
+      </w:pPr>
+      <w:r>
+        <w:rPr>
+          <w:lang w:val="en-US"/>
+        </w:rPr>
+        <w:t>Initially there may be an option for loading all files at once on entry</w:t>
+      </w:r>
+    </w:p>
+    <w:p>
+      <w:pPr>
+        <w:rPr>
+          <w:lang w:val="en-US"/>
+        </w:rPr>
+      </w:pPr>
+    </w:p>
+    <w:p>
+      <w:pPr>
+        <w:rPr>
+          <w:lang w:val="en-US"/>
+        </w:rPr>
+      </w:pPr>
+    </w:p>
+    <w:p>
+      <w:pPr>
+        <w:pStyle w:val="Heading2"/>
+        <w:rPr>
+          <w:lang w:val="en-US"/>
+        </w:rPr>
+      </w:pPr>
+      <w:r>
+        <w:rPr>
+          <w:lang w:val="en-US"/>
+        </w:rPr>
+        <w:t>Required improvements for Image R – 30/12/21</w:t>
+      </w:r>
+    </w:p>
+    <w:p>
+      <w:pPr>
+        <w:rPr>
+          <w:lang w:val="en-US"/>
+        </w:rPr>
+      </w:pPr>
+      <w:r>
+        <w:rPr>
+          <w:lang w:val="en-US"/>
+        </w:rPr>
+        <w:t>Need more control of “CT” mode with bias “-1024”</w:t>
+      </w:r>
+    </w:p>
+    <w:p>
+      <w:pPr>
+        <w:rPr>
+          <w:lang w:val="en-US"/>
+        </w:rPr>
+      </w:pPr>
+      <w:r>
+        <w:rPr>
+          <w:lang w:val="en-US"/>
+        </w:rPr>
+        <w:t>Allow more control of leafing/zooming all together – not clear when it is failing</w:t>
+      </w:r>
+    </w:p>
+    <w:p>
+      <w:pPr>
+        <w:rPr>
+          <w:lang w:val="en-US"/>
+        </w:rPr>
+      </w:pPr>
+      <w:r>
+        <w:rPr>
+          <w:lang w:val="en-US"/>
+        </w:rPr>
+        <w:t>Allow compare (diff) of short and float (and other types) in all modes</w:t>
+      </w:r>
+    </w:p>
+    <w:p>
+      <w:pPr>
+        <w:rPr>
+          <w:lang w:val="en-US"/>
+        </w:rPr>
+      </w:pPr>
+      <w:r>
+        <w:rPr>
+          <w:lang w:val="en-US"/>
+        </w:rPr>
+        <w:t>Fast leafing by loading all files from the disk – especially in multi-files Dicom series</w:t>
+      </w:r>
+    </w:p>
+    <w:p>
+      <w:pPr>
+        <w:rPr>
+          <w:lang w:val="en-US"/>
+        </w:rPr>
+      </w:pPr>
+    </w:p>
+    <w:p>
+      <w:pPr>
+        <w:pStyle w:val="Heading2"/>
+        <w:rPr>
+          <w:lang w:val="en-US"/>
+        </w:rPr>
+      </w:pPr>
+      <w:r>
+        <w:rPr>
+          <w:lang w:val="en-US"/>
+        </w:rPr>
         <w:t>Design Bug – connect leafing of different files’ types – v1.4.9 – 20/12/21</w:t>
       </w:r>
     </w:p>
@@ -469,6 +609,7 @@
         <w:rPr>
           <w:lang w:val="en-US"/>
         </w:rPr>
+        <w:lastRenderedPageBreak/>
         <w:t>Select file with Dicom template</w:t>
       </w:r>
     </w:p>
@@ -651,7 +792,6 @@
         <w:rPr>
           <w:lang w:val="en-US"/>
         </w:rPr>
-        <w:lastRenderedPageBreak/>
         <w:t>(28,11) is “image columns”</w:t>
       </w:r>
     </w:p>

</xml_diff>

<commit_message>
v1.5.1 - Allow configuration of fast scroll factor
</commit_message>
<xml_diff>
--- a/Docs/ImageR - work notes.docx
+++ b/Docs/ImageR - work notes.docx
@@ -50,6 +50,317 @@
         <w:rPr>
           <w:lang w:val="en-US"/>
         </w:rPr>
+        <w:t>Email to Daniel about leafing – 4/1/22</w:t>
+      </w:r>
+    </w:p>
+    <w:p>
+      <w:pPr>
+        <w:rPr>
+          <w:lang w:val="en-US"/>
+        </w:rPr>
+      </w:pPr>
+      <w:r>
+        <w:rPr>
+          <w:lang w:val="en-US"/>
+        </w:rPr>
+        <w:t>Hi Daniel,</w:t>
+      </w:r>
+    </w:p>
+    <w:p>
+      <w:pPr>
+        <w:rPr>
+          <w:lang w:val="en-US"/>
+        </w:rPr>
+      </w:pPr>
+      <w:r>
+        <w:rPr>
+          <w:lang w:val="en-US"/>
+        </w:rPr>
+        <w:t>After farther research, with help from your valuable inputs,</w:t>
+      </w:r>
+    </w:p>
+    <w:p>
+      <w:pPr>
+        <w:rPr>
+          <w:lang w:val="en-US"/>
+        </w:rPr>
+      </w:pPr>
+      <w:r>
+        <w:rPr>
+          <w:lang w:val="en-US"/>
+        </w:rPr>
+        <w:t>I think I solved the “leafing problem” in ImageR.</w:t>
+      </w:r>
+    </w:p>
+    <w:p>
+      <w:pPr>
+        <w:rPr>
+          <w:lang w:val="en-US"/>
+        </w:rPr>
+      </w:pPr>
+      <w:r>
+        <w:rPr>
+          <w:lang w:val="en-US"/>
+        </w:rPr>
+        <w:t>Apparently, I was using only the mouse wheel for leafing.</w:t>
+      </w:r>
+    </w:p>
+    <w:p>
+      <w:pPr>
+        <w:rPr>
+          <w:lang w:val="en-US"/>
+        </w:rPr>
+      </w:pPr>
+      <w:r>
+        <w:rPr>
+          <w:lang w:val="en-US"/>
+        </w:rPr>
+        <w:t>So, I didn’t tune correctly the leafing with the left-mouse button pressed.</w:t>
+      </w:r>
+    </w:p>
+    <w:p>
+      <w:pPr>
+        <w:rPr>
+          <w:lang w:val="en-US"/>
+        </w:rPr>
+      </w:pPr>
+      <w:r>
+        <w:rPr>
+          <w:lang w:val="en-US"/>
+        </w:rPr>
+        <w:t>The problem, as far as I can see, was not that the leafing was too slow,</w:t>
+      </w:r>
+    </w:p>
+    <w:p>
+      <w:pPr>
+        <w:rPr>
+          <w:lang w:val="en-US"/>
+        </w:rPr>
+      </w:pPr>
+      <w:r>
+        <w:rPr>
+          <w:lang w:val="en-US"/>
+        </w:rPr>
+        <w:t xml:space="preserve">But that at mouse movement all the increments went in fast, </w:t>
+      </w:r>
+    </w:p>
+    <w:p>
+      <w:pPr>
+        <w:rPr>
+          <w:lang w:val="en-US"/>
+        </w:rPr>
+      </w:pPr>
+      <w:r>
+        <w:rPr>
+          <w:lang w:val="en-US"/>
+        </w:rPr>
+        <w:t>And the subsequent display jumped too much to an unknown destination.</w:t>
+      </w:r>
+    </w:p>
+    <w:p>
+      <w:pPr>
+        <w:rPr>
+          <w:lang w:val="en-US"/>
+        </w:rPr>
+      </w:pPr>
+      <w:r>
+        <w:rPr>
+          <w:lang w:val="en-US"/>
+        </w:rPr>
+        <w:t>What I actually did is slow it down (</w:t>
+      </w:r>
+      <w:r>
+        <w:rPr>
+          <mc:AlternateContent>
+            <mc:Choice Requires="w16se"/>
+            <mc:Fallback>
+              <w:rFonts w:ascii="Segoe UI Emoji" w:eastAsia="Segoe UI Emoji" w:hAnsi="Segoe UI Emoji" w:cs="Segoe UI Emoji"/>
+            </mc:Fallback>
+          </mc:AlternateContent>
+          <w:lang w:val="en-US"/>
+        </w:rPr>
+        <mc:AlternateContent>
+          <mc:Choice Requires="w16se">
+            <w16se:symEx w16se:font="Segoe UI Emoji" w16se:char="1F60A"/>
+          </mc:Choice>
+          <mc:Fallback>
+            <w:t>😊</w:t>
+          </mc:Fallback>
+        </mc:AlternateContent>
+      </w:r>
+      <w:r>
+        <w:rPr>
+          <w:lang w:val="en-US"/>
+        </w:rPr>
+        <w:t>!) – Now I don’t allow more than a jump of 5 images.</w:t>
+      </w:r>
+    </w:p>
+    <w:p>
+      <w:pPr>
+        <w:rPr>
+          <w:lang w:val="en-US"/>
+        </w:rPr>
+      </w:pPr>
+      <w:r>
+        <w:rPr>
+          <w:lang w:val="en-US"/>
+        </w:rPr>
+        <w:t>So</w:t>
+      </w:r>
+      <w:r>
+        <w:rPr>
+          <w:lang w:val="en-US"/>
+        </w:rPr>
+        <w:t>,</w:t>
+      </w:r>
+      <w:r>
+        <w:rPr>
+          <w:lang w:val="en-US"/>
+        </w:rPr>
+        <w:t xml:space="preserve"> the leafing by the mouse-left is 5 times faster than the mouse wheel.</w:t>
+      </w:r>
+    </w:p>
+    <w:p>
+      <w:pPr>
+        <w:rPr>
+          <w:lang w:val="en-US"/>
+        </w:rPr>
+      </w:pPr>
+      <w:r>
+        <w:rPr>
+          <w:lang w:val="en-US"/>
+        </w:rPr>
+        <w:t>This is pretty fast but allows some feedback for our hand to go where we want to go.</w:t>
+      </w:r>
+    </w:p>
+    <w:p>
+      <w:pPr>
+        <w:rPr>
+          <w:lang w:val="en-US"/>
+        </w:rPr>
+      </w:pPr>
+      <w:r>
+        <w:rPr>
+          <w:lang w:val="en-US"/>
+        </w:rPr>
+        <w:t>Please try it and tell me whether you find it satisfactory.</w:t>
+      </w:r>
+    </w:p>
+    <w:p>
+      <w:pPr>
+        <w:rPr>
+          <w:lang w:val="en-US"/>
+        </w:rPr>
+      </w:pPr>
+      <w:r>
+        <w:rPr>
+          <w:lang w:val="en-US"/>
+        </w:rPr>
+        <w:t>If it is not perfect, I can still try to tune it better.</w:t>
+      </w:r>
+    </w:p>
+    <w:p>
+      <w:pPr>
+        <w:rPr>
+          <w:lang w:val="en-US"/>
+        </w:rPr>
+      </w:pPr>
+      <w:r>
+        <w:rPr>
+          <w:lang w:val="en-US"/>
+        </w:rPr>
+        <w:t xml:space="preserve">I’m still working on a new version of IQRA – </w:t>
+      </w:r>
+    </w:p>
+    <w:p>
+      <w:pPr>
+        <w:rPr>
+          <w:lang w:val="en-US"/>
+        </w:rPr>
+      </w:pPr>
+      <w:r>
+        <w:rPr>
+          <w:lang w:val="en-US"/>
+        </w:rPr>
+        <w:t>But I want some feedback on ImageR, so I put it in:</w:t>
+      </w:r>
+    </w:p>
+    <w:p>
+      <w:pPr>
+        <w:rPr>
+          <w:lang w:val="en-US"/>
+        </w:rPr>
+      </w:pPr>
+      <w:r>
+        <w:rPr>
+          <w:lang w:val="en-US"/>
+        </w:rPr>
+        <w:t>S:\Temp\YoavB\ImageR_v1.5.0</w:t>
+      </w:r>
+    </w:p>
+    <w:p>
+      <w:pPr>
+        <w:rPr>
+          <w:lang w:val="en-US"/>
+        </w:rPr>
+      </w:pPr>
+      <w:r>
+        <w:rPr>
+          <w:lang w:val="en-US"/>
+        </w:rPr>
+        <w:t>You can note also some valuable additions to the user’s manual there.</w:t>
+      </w:r>
+    </w:p>
+    <w:p>
+      <w:pPr>
+        <w:rPr>
+          <w:lang w:val="en-US"/>
+        </w:rPr>
+      </w:pPr>
+      <w:r>
+        <w:rPr>
+          <w:lang w:val="en-US"/>
+        </w:rPr>
+        <w:t>Any feedback would be welcomed.</w:t>
+      </w:r>
+    </w:p>
+    <w:p>
+      <w:pPr>
+        <w:rPr>
+          <w:lang w:val="en-US"/>
+        </w:rPr>
+      </w:pPr>
+      <w:r>
+        <w:rPr>
+          <w:lang w:val="en-US"/>
+        </w:rPr>
+        <w:t>Best,</w:t>
+      </w:r>
+    </w:p>
+    <w:p>
+      <w:pPr>
+        <w:rPr>
+          <w:lang w:val="en-US"/>
+        </w:rPr>
+      </w:pPr>
+      <w:r>
+        <w:rPr>
+          <w:lang w:val="en-US"/>
+        </w:rPr>
+        <w:t>Yoav</w:t>
+      </w:r>
+    </w:p>
+    <w:p>
+      <w:pPr>
+        <w:pStyle w:val="Heading2"/>
+        <w:rPr>
+          <w:lang w:val="en-US"/>
+        </w:rPr>
+      </w:pPr>
+      <w:r>
+        <w:rPr>
+          <w:lang w:val="en-US"/>
+        </w:rPr>
         <w:t>Fast leafing of Dicom files – 30/1/21</w:t>
       </w:r>
     </w:p>
@@ -343,6 +654,7 @@
         <w:rPr>
           <w:lang w:val="en-US"/>
         </w:rPr>
+        <w:lastRenderedPageBreak/>
         <w:t>Check different scenarios</w:t>
       </w:r>
     </w:p>
@@ -382,7 +694,21 @@
         <w:rPr>
           <w:lang w:val="en-US"/>
         </w:rPr>
-        <w:t>Check combinations of two dimensional files</w:t>
+        <w:t xml:space="preserve">Check combinations of </w:t>
+      </w:r>
+      <w:proofErr w:type="gramStart"/>
+      <w:r>
+        <w:rPr>
+          <w:lang w:val="en-US"/>
+        </w:rPr>
+        <w:t>two dimensional</w:t>
+      </w:r>
+      <w:proofErr w:type="gramEnd"/>
+      <w:r>
+        <w:rPr>
+          <w:lang w:val="en-US"/>
+        </w:rPr>
+        <w:t xml:space="preserve"> files</w:t>
       </w:r>
     </w:p>
     <w:p>
@@ -609,7 +935,6 @@
         <w:rPr>
           <w:lang w:val="en-US"/>
         </w:rPr>
-        <w:lastRenderedPageBreak/>
         <w:t>Select file with Dicom template</w:t>
       </w:r>
     </w:p>
@@ -714,24 +1039,25 @@
           <w:szCs w:val="18"/>
           <w:lang w:val="en-US"/>
         </w:rPr>
-        <w:t xml:space="preserve">  1 at 00000084:  G 0028 N 0010  Len        2 L    s 0x 08</w:t>
-      </w:r>
-    </w:p>
-    <w:p>
-      <w:pPr>
+        <w:t xml:space="preserve">  1 at 00000084:  G 0028 N </w:t>
+      </w:r>
+      <w:proofErr w:type="gramStart"/>
+      <w:r>
         <w:rPr>
           <w:sz w:val="18"/>
           <w:szCs w:val="18"/>
           <w:lang w:val="en-US"/>
         </w:rPr>
-      </w:pPr>
+        <w:t>0010  Len</w:t>
+      </w:r>
+      <w:proofErr w:type="gramEnd"/>
       <w:r>
         <w:rPr>
           <w:sz w:val="18"/>
           <w:szCs w:val="18"/>
           <w:lang w:val="en-US"/>
         </w:rPr>
-        <w:t xml:space="preserve">  2 at 0000008e:  G 0028 N 0011  Len        2 L     0x 86 08</w:t>
+        <w:t xml:space="preserve">        2 L    s 0x 08</w:t>
       </w:r>
     </w:p>
     <w:p>
@@ -748,7 +1074,60 @@
           <w:szCs w:val="18"/>
           <w:lang w:val="en-US"/>
         </w:rPr>
-        <w:t xml:space="preserve">  3 at 00000098:  G 7fe0 N 0010  Len  9439332 L     0x 00 00 bb 03 e6 03 c1 03 </w:t>
+        <w:t xml:space="preserve">  2 at 0000008e:  G 0028 N </w:t>
+      </w:r>
+      <w:proofErr w:type="gramStart"/>
+      <w:r>
+        <w:rPr>
+          <w:sz w:val="18"/>
+          <w:szCs w:val="18"/>
+          <w:lang w:val="en-US"/>
+        </w:rPr>
+        <w:t>0011  Len</w:t>
+      </w:r>
+      <w:proofErr w:type="gramEnd"/>
+      <w:r>
+        <w:rPr>
+          <w:sz w:val="18"/>
+          <w:szCs w:val="18"/>
+          <w:lang w:val="en-US"/>
+        </w:rPr>
+        <w:t xml:space="preserve">        2 L     0x 86 08</w:t>
+      </w:r>
+    </w:p>
+    <w:p>
+      <w:pPr>
+        <w:rPr>
+          <w:sz w:val="18"/>
+          <w:szCs w:val="18"/>
+          <w:lang w:val="en-US"/>
+        </w:rPr>
+      </w:pPr>
+      <w:r>
+        <w:rPr>
+          <w:sz w:val="18"/>
+          <w:szCs w:val="18"/>
+          <w:lang w:val="en-US"/>
+        </w:rPr>
+        <w:t xml:space="preserve">  3 at 00000098:  G 7fe0 N </w:t>
+      </w:r>
+      <w:proofErr w:type="gramStart"/>
+      <w:r>
+        <w:rPr>
+          <w:sz w:val="18"/>
+          <w:szCs w:val="18"/>
+          <w:lang w:val="en-US"/>
+        </w:rPr>
+        <w:t>0010  Len</w:t>
+      </w:r>
+      <w:proofErr w:type="gramEnd"/>
+      <w:r>
+        <w:rPr>
+          <w:sz w:val="18"/>
+          <w:szCs w:val="18"/>
+          <w:lang w:val="en-US"/>
+        </w:rPr>
+        <w:t xml:space="preserve">  9439332 L     0x 00 00 bb 03 e6 03 c1 03 </w:t>
       </w:r>
       <w:proofErr w:type="spellStart"/>
       <w:r>

</xml_diff>

<commit_message>
Update docs for v1.5.1
</commit_message>
<xml_diff>
--- a/Docs/ImageR - work notes.docx
+++ b/Docs/ImageR - work notes.docx
@@ -38,6 +38,59 @@
           <w:lang w:val="en-US"/>
         </w:rPr>
       </w:pPr>
+    </w:p>
+    <w:p>
+      <w:pPr>
+        <w:pStyle w:val="Heading2"/>
+        <w:rPr>
+          <w:lang w:val="en-US"/>
+        </w:rPr>
+      </w:pPr>
+      <w:r>
+        <w:rPr>
+          <w:lang w:val="en-US"/>
+        </w:rPr>
+        <w:t>Better control of leafing v1.5.1 – 5/1/22</w:t>
+      </w:r>
+    </w:p>
+    <w:p>
+      <w:pPr>
+        <w:rPr>
+          <w:lang w:val="en-US"/>
+        </w:rPr>
+      </w:pPr>
+      <w:r>
+        <w:rPr>
+          <w:lang w:val="en-US"/>
+        </w:rPr>
+        <w:t>Allow configuration of fast scroll factor.</w:t>
+      </w:r>
+    </w:p>
+    <w:p>
+      <w:pPr>
+        <w:rPr>
+          <w:lang w:val="en-US"/>
+        </w:rPr>
+      </w:pPr>
+      <w:r>
+        <w:rPr>
+          <w:lang w:val="en-US"/>
+        </w:rPr>
+        <w:t>Allow (optional, configurable) cyclic leafing.</w:t>
+      </w:r>
+    </w:p>
+    <w:p>
+      <w:pPr>
+        <w:rPr>
+          <w:lang w:val="en-US"/>
+        </w:rPr>
+      </w:pPr>
+      <w:r>
+        <w:rPr>
+          <w:lang w:val="en-US"/>
+        </w:rPr>
+        <w:t>Bugs in scrolling in v1.5.0 (found by Daniel) were corrected.</w:t>
+      </w:r>
     </w:p>
     <w:p>
       <w:pPr>
@@ -606,6 +659,7 @@
         <w:rPr>
           <w:lang w:val="en-US"/>
         </w:rPr>
+        <w:lastRenderedPageBreak/>
         <w:t>Global flag for position synchronization</w:t>
       </w:r>
     </w:p>
@@ -654,7 +708,6 @@
         <w:rPr>
           <w:lang w:val="en-US"/>
         </w:rPr>
-        <w:lastRenderedPageBreak/>
         <w:t>Check different scenarios</w:t>
       </w:r>
     </w:p>
@@ -694,21 +747,7 @@
         <w:rPr>
           <w:lang w:val="en-US"/>
         </w:rPr>
-        <w:t xml:space="preserve">Check combinations of </w:t>
-      </w:r>
-      <w:proofErr w:type="gramStart"/>
-      <w:r>
-        <w:rPr>
-          <w:lang w:val="en-US"/>
-        </w:rPr>
-        <w:t>two dimensional</w:t>
-      </w:r>
-      <w:proofErr w:type="gramEnd"/>
-      <w:r>
-        <w:rPr>
-          <w:lang w:val="en-US"/>
-        </w:rPr>
-        <w:t xml:space="preserve"> files</w:t>
+        <w:t>Check combinations of two dimensional files</w:t>
       </w:r>
     </w:p>
     <w:p>
@@ -1039,25 +1078,24 @@
           <w:szCs w:val="18"/>
           <w:lang w:val="en-US"/>
         </w:rPr>
-        <w:t xml:space="preserve">  1 at 00000084:  G 0028 N </w:t>
-      </w:r>
-      <w:proofErr w:type="gramStart"/>
-      <w:r>
+        <w:t xml:space="preserve">  1 at 00000084:  G 0028 N 0010  Len        2 L    s 0x 08</w:t>
+      </w:r>
+    </w:p>
+    <w:p>
+      <w:pPr>
         <w:rPr>
           <w:sz w:val="18"/>
           <w:szCs w:val="18"/>
           <w:lang w:val="en-US"/>
         </w:rPr>
-        <w:t>0010  Len</w:t>
-      </w:r>
-      <w:proofErr w:type="gramEnd"/>
+      </w:pPr>
       <w:r>
         <w:rPr>
           <w:sz w:val="18"/>
           <w:szCs w:val="18"/>
           <w:lang w:val="en-US"/>
         </w:rPr>
-        <w:t xml:space="preserve">        2 L    s 0x 08</w:t>
+        <w:t xml:space="preserve">  2 at 0000008e:  G 0028 N 0011  Len        2 L     0x 86 08</w:t>
       </w:r>
     </w:p>
     <w:p>
@@ -1074,60 +1112,7 @@
           <w:szCs w:val="18"/>
           <w:lang w:val="en-US"/>
         </w:rPr>
-        <w:t xml:space="preserve">  2 at 0000008e:  G 0028 N </w:t>
-      </w:r>
-      <w:proofErr w:type="gramStart"/>
-      <w:r>
-        <w:rPr>
-          <w:sz w:val="18"/>
-          <w:szCs w:val="18"/>
-          <w:lang w:val="en-US"/>
-        </w:rPr>
-        <w:t>0011  Len</w:t>
-      </w:r>
-      <w:proofErr w:type="gramEnd"/>
-      <w:r>
-        <w:rPr>
-          <w:sz w:val="18"/>
-          <w:szCs w:val="18"/>
-          <w:lang w:val="en-US"/>
-        </w:rPr>
-        <w:t xml:space="preserve">        2 L     0x 86 08</w:t>
-      </w:r>
-    </w:p>
-    <w:p>
-      <w:pPr>
-        <w:rPr>
-          <w:sz w:val="18"/>
-          <w:szCs w:val="18"/>
-          <w:lang w:val="en-US"/>
-        </w:rPr>
-      </w:pPr>
-      <w:r>
-        <w:rPr>
-          <w:sz w:val="18"/>
-          <w:szCs w:val="18"/>
-          <w:lang w:val="en-US"/>
-        </w:rPr>
-        <w:t xml:space="preserve">  3 at 00000098:  G 7fe0 N </w:t>
-      </w:r>
-      <w:proofErr w:type="gramStart"/>
-      <w:r>
-        <w:rPr>
-          <w:sz w:val="18"/>
-          <w:szCs w:val="18"/>
-          <w:lang w:val="en-US"/>
-        </w:rPr>
-        <w:t>0010  Len</w:t>
-      </w:r>
-      <w:proofErr w:type="gramEnd"/>
-      <w:r>
-        <w:rPr>
-          <w:sz w:val="18"/>
-          <w:szCs w:val="18"/>
-          <w:lang w:val="en-US"/>
-        </w:rPr>
-        <w:t xml:space="preserve">  9439332 L     0x 00 00 bb 03 e6 03 c1 03 </w:t>
+        <w:t xml:space="preserve">  3 at 00000098:  G 7fe0 N 0010  Len  9439332 L     0x 00 00 bb 03 e6 03 c1 03 </w:t>
       </w:r>
       <w:proofErr w:type="spellStart"/>
       <w:r>

</xml_diff>

<commit_message>
Support for Replace 2 + Coronals (etc) on on dual source
</commit_message>
<xml_diff>
--- a/Docs/ImageR - work notes.docx
+++ b/Docs/ImageR - work notes.docx
@@ -30,6 +30,40 @@
           <w:lang w:val="en-US"/>
         </w:rPr>
         <w:t>Work Notes</w:t>
+      </w:r>
+    </w:p>
+    <w:p>
+      <w:pPr>
+        <w:rPr>
+          <w:lang w:val="en-US"/>
+        </w:rPr>
+      </w:pPr>
+    </w:p>
+    <w:p>
+      <w:pPr>
+        <w:pStyle w:val="Heading2"/>
+        <w:rPr>
+          <w:lang w:val="en-US"/>
+        </w:rPr>
+      </w:pPr>
+      <w:r>
+        <w:rPr>
+          <w:lang w:val="en-US"/>
+        </w:rPr>
+        <w:t>Support of loading saved case with multi-Variant 10-13/1/22</w:t>
+      </w:r>
+    </w:p>
+    <w:p>
+      <w:pPr>
+        <w:rPr>
+          <w:lang w:val="en-US"/>
+        </w:rPr>
+      </w:pPr>
+      <w:r>
+        <w:rPr>
+          <w:lang w:val="en-US"/>
+        </w:rPr>
+        <w:t>Take care to bring same zoom and window to both variants.</w:t>
       </w:r>
     </w:p>
     <w:p>
@@ -620,6 +654,7 @@
         <w:rPr>
           <w:lang w:val="en-US"/>
         </w:rPr>
+        <w:lastRenderedPageBreak/>
         <w:t>Design for solution</w:t>
       </w:r>
     </w:p>
@@ -659,7 +694,6 @@
         <w:rPr>
           <w:lang w:val="en-US"/>
         </w:rPr>
-        <w:lastRenderedPageBreak/>
         <w:t>Global flag for position synchronization</w:t>
       </w:r>
     </w:p>

</xml_diff>

<commit_message>
V1.5.9 - better handling of CT mode
</commit_message>
<xml_diff>
--- a/Docs/ImageR - work notes.docx
+++ b/Docs/ImageR - work notes.docx
@@ -1,6 +1,6 @@
 
 <file path=word/document.xml><?xml version="1.0" encoding="utf-8"?>
-<w:document xmlns:wpc="http://schemas.microsoft.com/office/word/2010/wordprocessingCanvas" xmlns:cx="http://schemas.microsoft.com/office/drawing/2014/chartex" xmlns:cx1="http://schemas.microsoft.com/office/drawing/2015/9/8/chartex" xmlns:cx2="http://schemas.microsoft.com/office/drawing/2015/10/21/chartex" xmlns:cx3="http://schemas.microsoft.com/office/drawing/2016/5/9/chartex" xmlns:cx4="http://schemas.microsoft.com/office/drawing/2016/5/10/chartex" xmlns:cx5="http://schemas.microsoft.com/office/drawing/2016/5/11/chartex" xmlns:cx6="http://schemas.microsoft.com/office/drawing/2016/5/12/chartex" xmlns:cx7="http://schemas.microsoft.com/office/drawing/2016/5/13/chartex" xmlns:cx8="http://schemas.microsoft.com/office/drawing/2016/5/14/chartex" xmlns:mc="http://schemas.openxmlformats.org/markup-compatibility/2006" xmlns:aink="http://schemas.microsoft.com/office/drawing/2016/ink" xmlns:am3d="http://schemas.microsoft.com/office/drawing/2017/model3d" xmlns:o="urn:schemas-microsoft-com:office:office" xmlns:r="http://schemas.openxmlformats.org/officeDocument/2006/relationships" xmlns:m="http://schemas.openxmlformats.org/officeDocument/2006/math" xmlns:v="urn:schemas-microsoft-com:vml" xmlns:wp14="http://schemas.microsoft.com/office/word/2010/wordprocessingDrawing" xmlns:wp="http://schemas.openxmlformats.org/drawingml/2006/wordprocessingDrawing" xmlns:w10="urn:schemas-microsoft-com:office:word" xmlns:w="http://schemas.openxmlformats.org/wordprocessingml/2006/main" xmlns:w14="http://schemas.microsoft.com/office/word/2010/wordml" xmlns:w15="http://schemas.microsoft.com/office/word/2012/wordml" xmlns:w16cex="http://schemas.microsoft.com/office/word/2018/wordml/cex" xmlns:w16cid="http://schemas.microsoft.com/office/word/2016/wordml/cid" xmlns:w16="http://schemas.microsoft.com/office/word/2018/wordml" xmlns:w16sdtdh="http://schemas.microsoft.com/office/word/2020/wordml/sdtdatahash" xmlns:w16se="http://schemas.microsoft.com/office/word/2015/wordml/symex" xmlns:wpg="http://schemas.microsoft.com/office/word/2010/wordprocessingGroup" xmlns:wpi="http://schemas.microsoft.com/office/word/2010/wordprocessingInk" xmlns:wne="http://schemas.microsoft.com/office/word/2006/wordml" xmlns:wps="http://schemas.microsoft.com/office/word/2010/wordprocessingShape" mc:Ignorable="w14 w15 w16se w16cid w16 w16cex w16sdtdh wp14">
+<w:document xmlns:wpc="http://schemas.microsoft.com/office/word/2010/wordprocessingCanvas" xmlns:cx="http://schemas.microsoft.com/office/drawing/2014/chartex" xmlns:cx1="http://schemas.microsoft.com/office/drawing/2015/9/8/chartex" xmlns:cx2="http://schemas.microsoft.com/office/drawing/2015/10/21/chartex" xmlns:cx3="http://schemas.microsoft.com/office/drawing/2016/5/9/chartex" xmlns:cx4="http://schemas.microsoft.com/office/drawing/2016/5/10/chartex" xmlns:cx5="http://schemas.microsoft.com/office/drawing/2016/5/11/chartex" xmlns:cx6="http://schemas.microsoft.com/office/drawing/2016/5/12/chartex" xmlns:cx7="http://schemas.microsoft.com/office/drawing/2016/5/13/chartex" xmlns:cx8="http://schemas.microsoft.com/office/drawing/2016/5/14/chartex" xmlns:mc="http://schemas.openxmlformats.org/markup-compatibility/2006" xmlns:aink="http://schemas.microsoft.com/office/drawing/2016/ink" xmlns:am3d="http://schemas.microsoft.com/office/drawing/2017/model3d" xmlns:o="urn:schemas-microsoft-com:office:office" xmlns:oel="http://schemas.microsoft.com/office/2019/extlst" xmlns:r="http://schemas.openxmlformats.org/officeDocument/2006/relationships" xmlns:m="http://schemas.openxmlformats.org/officeDocument/2006/math" xmlns:v="urn:schemas-microsoft-com:vml" xmlns:wp14="http://schemas.microsoft.com/office/word/2010/wordprocessingDrawing" xmlns:wp="http://schemas.openxmlformats.org/drawingml/2006/wordprocessingDrawing" xmlns:w10="urn:schemas-microsoft-com:office:word" xmlns:w="http://schemas.openxmlformats.org/wordprocessingml/2006/main" xmlns:w14="http://schemas.microsoft.com/office/word/2010/wordml" xmlns:w15="http://schemas.microsoft.com/office/word/2012/wordml" xmlns:w16cex="http://schemas.microsoft.com/office/word/2018/wordml/cex" xmlns:w16cid="http://schemas.microsoft.com/office/word/2016/wordml/cid" xmlns:w16="http://schemas.microsoft.com/office/word/2018/wordml" xmlns:w16sdtdh="http://schemas.microsoft.com/office/word/2020/wordml/sdtdatahash" xmlns:w16se="http://schemas.microsoft.com/office/word/2015/wordml/symex" xmlns:wpg="http://schemas.microsoft.com/office/word/2010/wordprocessingGroup" xmlns:wpi="http://schemas.microsoft.com/office/word/2010/wordprocessingInk" xmlns:wne="http://schemas.microsoft.com/office/word/2006/wordml" xmlns:wps="http://schemas.microsoft.com/office/word/2010/wordprocessingShape" mc:Ignorable="w14 w15 w16se w16cid w16 w16cex w16sdtdh wp14">
   <w:body>
     <w:p>
       <w:pPr>
@@ -30,6 +30,130 @@
           <w:lang w:val="en-US"/>
         </w:rPr>
         <w:t>Work Notes</w:t>
+      </w:r>
+    </w:p>
+    <w:p>
+      <w:pPr>
+        <w:rPr>
+          <w:lang w:val="en-US"/>
+        </w:rPr>
+      </w:pPr>
+    </w:p>
+    <w:p>
+      <w:pPr>
+        <w:pStyle w:val="Heading2"/>
+        <w:rPr>
+          <w:lang w:val="en-US"/>
+        </w:rPr>
+      </w:pPr>
+      <w:r>
+        <w:rPr>
+          <w:lang w:val="en-US"/>
+        </w:rPr>
+        <w:t>Better features for daily work – 29/5/22</w:t>
+      </w:r>
+    </w:p>
+    <w:p>
+      <w:pPr>
+        <w:rPr>
+          <w:lang w:val="en-US"/>
+        </w:rPr>
+      </w:pPr>
+      <w:r>
+        <w:rPr>
+          <w:lang w:val="en-US"/>
+        </w:rPr>
+        <w:t>As I work on image quality tests:</w:t>
+      </w:r>
+    </w:p>
+    <w:p>
+      <w:pPr>
+        <w:pStyle w:val="ListParagraph"/>
+        <w:numPr>
+          <w:ilvl w:val="0"/>
+          <w:numId w:val="1"/>
+        </w:numPr>
+        <w:rPr>
+          <w:lang w:val="en-US"/>
+        </w:rPr>
+      </w:pPr>
+      <w:r>
+        <w:rPr>
+          <w:lang w:val="en-US"/>
+        </w:rPr>
+        <w:t>Compare two sets of images – by different criteria</w:t>
+      </w:r>
+    </w:p>
+    <w:p>
+      <w:pPr>
+        <w:pStyle w:val="ListParagraph"/>
+        <w:numPr>
+          <w:ilvl w:val="0"/>
+          <w:numId w:val="1"/>
+        </w:numPr>
+        <w:rPr>
+          <w:lang w:val="en-US"/>
+        </w:rPr>
+      </w:pPr>
+      <w:r>
+        <w:rPr>
+          <w:lang w:val="en-US"/>
+        </w:rPr>
+        <w:t>Compare multiple sets of images</w:t>
+      </w:r>
+    </w:p>
+    <w:p>
+      <w:pPr>
+        <w:pStyle w:val="ListParagraph"/>
+        <w:numPr>
+          <w:ilvl w:val="0"/>
+          <w:numId w:val="1"/>
+        </w:numPr>
+        <w:rPr>
+          <w:lang w:val="en-US"/>
+        </w:rPr>
+      </w:pPr>
+      <w:r>
+        <w:rPr>
+          <w:lang w:val="en-US"/>
+        </w:rPr>
+        <w:t>Slow windowing when dynamic range is small</w:t>
+      </w:r>
+    </w:p>
+    <w:p>
+      <w:pPr>
+        <w:pStyle w:val="ListParagraph"/>
+        <w:numPr>
+          <w:ilvl w:val="0"/>
+          <w:numId w:val="1"/>
+        </w:numPr>
+        <w:rPr>
+          <w:lang w:val="en-US"/>
+        </w:rPr>
+      </w:pPr>
+      <w:r>
+        <w:rPr>
+          <w:lang w:val="en-US"/>
+        </w:rPr>
+        <w:t>Allow control (“settings”) of CT image bias</w:t>
+      </w:r>
+    </w:p>
+    <w:p>
+      <w:pPr>
+        <w:pStyle w:val="ListParagraph"/>
+        <w:numPr>
+          <w:ilvl w:val="0"/>
+          <w:numId w:val="1"/>
+        </w:numPr>
+        <w:rPr>
+          <w:lang w:val="en-US"/>
+        </w:rPr>
+      </w:pPr>
+      <w:r>
+        <w:rPr>
+          <w:lang w:val="en-US"/>
+        </w:rPr>
+        <w:t>Allow starting graphics in “all” and “stat” mode (by double click?)</w:t>
       </w:r>
     </w:p>
     <w:p>
@@ -554,6 +678,7 @@
         <w:rPr>
           <w:lang w:val="en-US"/>
         </w:rPr>
+        <w:lastRenderedPageBreak/>
         <w:t>Allow compare (diff) of short and float (and other types) in all modes</w:t>
       </w:r>
     </w:p>
@@ -654,7 +779,6 @@
         <w:rPr>
           <w:lang w:val="en-US"/>
         </w:rPr>
-        <w:lastRenderedPageBreak/>
         <w:t>Design for solution</w:t>
       </w:r>
     </w:p>
@@ -781,7 +905,21 @@
         <w:rPr>
           <w:lang w:val="en-US"/>
         </w:rPr>
-        <w:t>Check combinations of two dimensional files</w:t>
+        <w:t xml:space="preserve">Check combinations of </w:t>
+      </w:r>
+      <w:proofErr w:type="gramStart"/>
+      <w:r>
+        <w:rPr>
+          <w:lang w:val="en-US"/>
+        </w:rPr>
+        <w:t>two dimensional</w:t>
+      </w:r>
+      <w:proofErr w:type="gramEnd"/>
+      <w:r>
+        <w:rPr>
+          <w:lang w:val="en-US"/>
+        </w:rPr>
+        <w:t xml:space="preserve"> files</w:t>
       </w:r>
     </w:p>
     <w:p>
@@ -1112,24 +1250,25 @@
           <w:szCs w:val="18"/>
           <w:lang w:val="en-US"/>
         </w:rPr>
-        <w:t xml:space="preserve">  1 at 00000084:  G 0028 N 0010  Len        2 L    s 0x 08</w:t>
-      </w:r>
-    </w:p>
-    <w:p>
-      <w:pPr>
+        <w:t xml:space="preserve">  1 at 00000084:  G 0028 N </w:t>
+      </w:r>
+      <w:proofErr w:type="gramStart"/>
+      <w:r>
         <w:rPr>
           <w:sz w:val="18"/>
           <w:szCs w:val="18"/>
           <w:lang w:val="en-US"/>
         </w:rPr>
-      </w:pPr>
+        <w:t>0010  Len</w:t>
+      </w:r>
+      <w:proofErr w:type="gramEnd"/>
       <w:r>
         <w:rPr>
           <w:sz w:val="18"/>
           <w:szCs w:val="18"/>
           <w:lang w:val="en-US"/>
         </w:rPr>
-        <w:t xml:space="preserve">  2 at 0000008e:  G 0028 N 0011  Len        2 L     0x 86 08</w:t>
+        <w:t xml:space="preserve">        2 L    s 0x 08</w:t>
       </w:r>
     </w:p>
     <w:p>
@@ -1146,7 +1285,60 @@
           <w:szCs w:val="18"/>
           <w:lang w:val="en-US"/>
         </w:rPr>
-        <w:t xml:space="preserve">  3 at 00000098:  G 7fe0 N 0010  Len  9439332 L     0x 00 00 bb 03 e6 03 c1 03 </w:t>
+        <w:t xml:space="preserve">  2 at 0000008e:  G 0028 N </w:t>
+      </w:r>
+      <w:proofErr w:type="gramStart"/>
+      <w:r>
+        <w:rPr>
+          <w:sz w:val="18"/>
+          <w:szCs w:val="18"/>
+          <w:lang w:val="en-US"/>
+        </w:rPr>
+        <w:t>0011  Len</w:t>
+      </w:r>
+      <w:proofErr w:type="gramEnd"/>
+      <w:r>
+        <w:rPr>
+          <w:sz w:val="18"/>
+          <w:szCs w:val="18"/>
+          <w:lang w:val="en-US"/>
+        </w:rPr>
+        <w:t xml:space="preserve">        2 L     0x 86 08</w:t>
+      </w:r>
+    </w:p>
+    <w:p>
+      <w:pPr>
+        <w:rPr>
+          <w:sz w:val="18"/>
+          <w:szCs w:val="18"/>
+          <w:lang w:val="en-US"/>
+        </w:rPr>
+      </w:pPr>
+      <w:r>
+        <w:rPr>
+          <w:sz w:val="18"/>
+          <w:szCs w:val="18"/>
+          <w:lang w:val="en-US"/>
+        </w:rPr>
+        <w:t xml:space="preserve">  3 at 00000098:  G 7fe0 N </w:t>
+      </w:r>
+      <w:proofErr w:type="gramStart"/>
+      <w:r>
+        <w:rPr>
+          <w:sz w:val="18"/>
+          <w:szCs w:val="18"/>
+          <w:lang w:val="en-US"/>
+        </w:rPr>
+        <w:t>0010  Len</w:t>
+      </w:r>
+      <w:proofErr w:type="gramEnd"/>
+      <w:r>
+        <w:rPr>
+          <w:sz w:val="18"/>
+          <w:szCs w:val="18"/>
+          <w:lang w:val="en-US"/>
+        </w:rPr>
+        <w:t xml:space="preserve">  9439332 L     0x 00 00 bb 03 e6 03 c1 03 </w:t>
       </w:r>
       <w:proofErr w:type="spellStart"/>
       <w:r>
@@ -1208,6 +1400,103 @@
     </w:sectPr>
   </w:body>
 </w:document>
+</file>
+
+<file path=word/numbering.xml><?xml version="1.0" encoding="utf-8"?>
+<w:numbering xmlns:wpc="http://schemas.microsoft.com/office/word/2010/wordprocessingCanvas" xmlns:cx="http://schemas.microsoft.com/office/drawing/2014/chartex" xmlns:cx1="http://schemas.microsoft.com/office/drawing/2015/9/8/chartex" xmlns:cx2="http://schemas.microsoft.com/office/drawing/2015/10/21/chartex" xmlns:cx3="http://schemas.microsoft.com/office/drawing/2016/5/9/chartex" xmlns:cx4="http://schemas.microsoft.com/office/drawing/2016/5/10/chartex" xmlns:cx5="http://schemas.microsoft.com/office/drawing/2016/5/11/chartex" xmlns:cx6="http://schemas.microsoft.com/office/drawing/2016/5/12/chartex" xmlns:cx7="http://schemas.microsoft.com/office/drawing/2016/5/13/chartex" xmlns:cx8="http://schemas.microsoft.com/office/drawing/2016/5/14/chartex" xmlns:mc="http://schemas.openxmlformats.org/markup-compatibility/2006" xmlns:aink="http://schemas.microsoft.com/office/drawing/2016/ink" xmlns:am3d="http://schemas.microsoft.com/office/drawing/2017/model3d" xmlns:o="urn:schemas-microsoft-com:office:office" xmlns:oel="http://schemas.microsoft.com/office/2019/extlst" xmlns:r="http://schemas.openxmlformats.org/officeDocument/2006/relationships" xmlns:m="http://schemas.openxmlformats.org/officeDocument/2006/math" xmlns:v="urn:schemas-microsoft-com:vml" xmlns:wp14="http://schemas.microsoft.com/office/word/2010/wordprocessingDrawing" xmlns:wp="http://schemas.openxmlformats.org/drawingml/2006/wordprocessingDrawing" xmlns:w10="urn:schemas-microsoft-com:office:word" xmlns:w="http://schemas.openxmlformats.org/wordprocessingml/2006/main" xmlns:w14="http://schemas.microsoft.com/office/word/2010/wordml" xmlns:w15="http://schemas.microsoft.com/office/word/2012/wordml" xmlns:w16cex="http://schemas.microsoft.com/office/word/2018/wordml/cex" xmlns:w16cid="http://schemas.microsoft.com/office/word/2016/wordml/cid" xmlns:w16="http://schemas.microsoft.com/office/word/2018/wordml" xmlns:w16sdtdh="http://schemas.microsoft.com/office/word/2020/wordml/sdtdatahash" xmlns:w16se="http://schemas.microsoft.com/office/word/2015/wordml/symex" xmlns:wpg="http://schemas.microsoft.com/office/word/2010/wordprocessingGroup" xmlns:wpi="http://schemas.microsoft.com/office/word/2010/wordprocessingInk" xmlns:wne="http://schemas.microsoft.com/office/word/2006/wordml" xmlns:wps="http://schemas.microsoft.com/office/word/2010/wordprocessingShape" mc:Ignorable="w14 w15 w16se w16cid w16 w16cex w16sdtdh wp14">
+  <w:abstractNum w:abstractNumId="0" w15:restartNumberingAfterBreak="0">
+    <w:nsid w:val="2DDB6DAF"/>
+    <w:multiLevelType w:val="hybridMultilevel"/>
+    <w:tmpl w:val="BDEA3534"/>
+    <w:lvl w:ilvl="0" w:tplc="86F841DA">
+      <w:start w:val="1"/>
+      <w:numFmt w:val="decimal"/>
+      <w:lvlText w:val="%1)"/>
+      <w:lvlJc w:val="left"/>
+      <w:pPr>
+        <w:ind w:left="720" w:hanging="360"/>
+      </w:pPr>
+      <w:rPr>
+        <w:rFonts w:hint="default"/>
+      </w:rPr>
+    </w:lvl>
+    <w:lvl w:ilvl="1" w:tplc="20000019" w:tentative="1">
+      <w:start w:val="1"/>
+      <w:numFmt w:val="lowerLetter"/>
+      <w:lvlText w:val="%2."/>
+      <w:lvlJc w:val="left"/>
+      <w:pPr>
+        <w:ind w:left="1440" w:hanging="360"/>
+      </w:pPr>
+    </w:lvl>
+    <w:lvl w:ilvl="2" w:tplc="2000001B" w:tentative="1">
+      <w:start w:val="1"/>
+      <w:numFmt w:val="lowerRoman"/>
+      <w:lvlText w:val="%3."/>
+      <w:lvlJc w:val="right"/>
+      <w:pPr>
+        <w:ind w:left="2160" w:hanging="180"/>
+      </w:pPr>
+    </w:lvl>
+    <w:lvl w:ilvl="3" w:tplc="2000000F" w:tentative="1">
+      <w:start w:val="1"/>
+      <w:numFmt w:val="decimal"/>
+      <w:lvlText w:val="%4."/>
+      <w:lvlJc w:val="left"/>
+      <w:pPr>
+        <w:ind w:left="2880" w:hanging="360"/>
+      </w:pPr>
+    </w:lvl>
+    <w:lvl w:ilvl="4" w:tplc="20000019" w:tentative="1">
+      <w:start w:val="1"/>
+      <w:numFmt w:val="lowerLetter"/>
+      <w:lvlText w:val="%5."/>
+      <w:lvlJc w:val="left"/>
+      <w:pPr>
+        <w:ind w:left="3600" w:hanging="360"/>
+      </w:pPr>
+    </w:lvl>
+    <w:lvl w:ilvl="5" w:tplc="2000001B" w:tentative="1">
+      <w:start w:val="1"/>
+      <w:numFmt w:val="lowerRoman"/>
+      <w:lvlText w:val="%6."/>
+      <w:lvlJc w:val="right"/>
+      <w:pPr>
+        <w:ind w:left="4320" w:hanging="180"/>
+      </w:pPr>
+    </w:lvl>
+    <w:lvl w:ilvl="6" w:tplc="2000000F" w:tentative="1">
+      <w:start w:val="1"/>
+      <w:numFmt w:val="decimal"/>
+      <w:lvlText w:val="%7."/>
+      <w:lvlJc w:val="left"/>
+      <w:pPr>
+        <w:ind w:left="5040" w:hanging="360"/>
+      </w:pPr>
+    </w:lvl>
+    <w:lvl w:ilvl="7" w:tplc="20000019" w:tentative="1">
+      <w:start w:val="1"/>
+      <w:numFmt w:val="lowerLetter"/>
+      <w:lvlText w:val="%8."/>
+      <w:lvlJc w:val="left"/>
+      <w:pPr>
+        <w:ind w:left="5760" w:hanging="360"/>
+      </w:pPr>
+    </w:lvl>
+    <w:lvl w:ilvl="8" w:tplc="2000001B" w:tentative="1">
+      <w:start w:val="1"/>
+      <w:numFmt w:val="lowerRoman"/>
+      <w:lvlText w:val="%9."/>
+      <w:lvlJc w:val="right"/>
+      <w:pPr>
+        <w:ind w:left="6480" w:hanging="180"/>
+      </w:pPr>
+    </w:lvl>
+  </w:abstractNum>
+  <w:num w:numId="1" w16cid:durableId="1474442835">
+    <w:abstractNumId w:val="0"/>
+  </w:num>
+</w:numbering>
 </file>
 
 <file path=word/styles.xml><?xml version="1.0" encoding="utf-8"?>
@@ -1779,6 +2068,17 @@
       <w:color w:val="2F5496" w:themeColor="accent1" w:themeShade="BF"/>
     </w:rPr>
   </w:style>
+  <w:style w:type="paragraph" w:styleId="ListParagraph">
+    <w:name w:val="List Paragraph"/>
+    <w:basedOn w:val="Normal"/>
+    <w:uiPriority w:val="34"/>
+    <w:qFormat/>
+    <w:rsid w:val="00DB7CAF"/>
+    <w:pPr>
+      <w:ind w:left="720"/>
+      <w:contextualSpacing/>
+    </w:pPr>
+  </w:style>
 </w:styles>
 </file>
 

</xml_diff>

<commit_message>
Simpler handling of bias - united for different image types + control from image parameters protocol
</commit_message>
<xml_diff>
--- a/Docs/ImageR - work notes.docx
+++ b/Docs/ImageR - work notes.docx
@@ -1,6 +1,6 @@
 
 <file path=word/document.xml><?xml version="1.0" encoding="utf-8"?>
-<w:document xmlns:wpc="http://schemas.microsoft.com/office/word/2010/wordprocessingCanvas" xmlns:cx="http://schemas.microsoft.com/office/drawing/2014/chartex" xmlns:cx1="http://schemas.microsoft.com/office/drawing/2015/9/8/chartex" xmlns:cx2="http://schemas.microsoft.com/office/drawing/2015/10/21/chartex" xmlns:cx3="http://schemas.microsoft.com/office/drawing/2016/5/9/chartex" xmlns:cx4="http://schemas.microsoft.com/office/drawing/2016/5/10/chartex" xmlns:cx5="http://schemas.microsoft.com/office/drawing/2016/5/11/chartex" xmlns:cx6="http://schemas.microsoft.com/office/drawing/2016/5/12/chartex" xmlns:cx7="http://schemas.microsoft.com/office/drawing/2016/5/13/chartex" xmlns:cx8="http://schemas.microsoft.com/office/drawing/2016/5/14/chartex" xmlns:mc="http://schemas.openxmlformats.org/markup-compatibility/2006" xmlns:aink="http://schemas.microsoft.com/office/drawing/2016/ink" xmlns:am3d="http://schemas.microsoft.com/office/drawing/2017/model3d" xmlns:o="urn:schemas-microsoft-com:office:office" xmlns:oel="http://schemas.microsoft.com/office/2019/extlst" xmlns:r="http://schemas.openxmlformats.org/officeDocument/2006/relationships" xmlns:m="http://schemas.openxmlformats.org/officeDocument/2006/math" xmlns:v="urn:schemas-microsoft-com:vml" xmlns:wp14="http://schemas.microsoft.com/office/word/2010/wordprocessingDrawing" xmlns:wp="http://schemas.openxmlformats.org/drawingml/2006/wordprocessingDrawing" xmlns:w10="urn:schemas-microsoft-com:office:word" xmlns:w="http://schemas.openxmlformats.org/wordprocessingml/2006/main" xmlns:w14="http://schemas.microsoft.com/office/word/2010/wordml" xmlns:w15="http://schemas.microsoft.com/office/word/2012/wordml" xmlns:w16cex="http://schemas.microsoft.com/office/word/2018/wordml/cex" xmlns:w16cid="http://schemas.microsoft.com/office/word/2016/wordml/cid" xmlns:w16="http://schemas.microsoft.com/office/word/2018/wordml" xmlns:w16sdtdh="http://schemas.microsoft.com/office/word/2020/wordml/sdtdatahash" xmlns:w16se="http://schemas.microsoft.com/office/word/2015/wordml/symex" xmlns:wpg="http://schemas.microsoft.com/office/word/2010/wordprocessingGroup" xmlns:wpi="http://schemas.microsoft.com/office/word/2010/wordprocessingInk" xmlns:wne="http://schemas.microsoft.com/office/word/2006/wordml" xmlns:wps="http://schemas.microsoft.com/office/word/2010/wordprocessingShape" mc:Ignorable="w14 w15 w16se w16cid w16 w16cex w16sdtdh wp14">
+<w:document xmlns:wpc="http://schemas.microsoft.com/office/word/2010/wordprocessingCanvas" xmlns:cx="http://schemas.microsoft.com/office/drawing/2014/chartex" xmlns:cx1="http://schemas.microsoft.com/office/drawing/2015/9/8/chartex" xmlns:cx2="http://schemas.microsoft.com/office/drawing/2015/10/21/chartex" xmlns:cx3="http://schemas.microsoft.com/office/drawing/2016/5/9/chartex" xmlns:cx4="http://schemas.microsoft.com/office/drawing/2016/5/10/chartex" xmlns:cx5="http://schemas.microsoft.com/office/drawing/2016/5/11/chartex" xmlns:cx6="http://schemas.microsoft.com/office/drawing/2016/5/12/chartex" xmlns:cx7="http://schemas.microsoft.com/office/drawing/2016/5/13/chartex" xmlns:cx8="http://schemas.microsoft.com/office/drawing/2016/5/14/chartex" xmlns:mc="http://schemas.openxmlformats.org/markup-compatibility/2006" xmlns:aink="http://schemas.microsoft.com/office/drawing/2016/ink" xmlns:am3d="http://schemas.microsoft.com/office/drawing/2017/model3d" xmlns:o="urn:schemas-microsoft-com:office:office" xmlns:oel="http://schemas.microsoft.com/office/2019/extlst" xmlns:r="http://schemas.openxmlformats.org/officeDocument/2006/relationships" xmlns:m="http://schemas.openxmlformats.org/officeDocument/2006/math" xmlns:v="urn:schemas-microsoft-com:vml" xmlns:wp14="http://schemas.microsoft.com/office/word/2010/wordprocessingDrawing" xmlns:wp="http://schemas.openxmlformats.org/drawingml/2006/wordprocessingDrawing" xmlns:w10="urn:schemas-microsoft-com:office:word" xmlns:w="http://schemas.openxmlformats.org/wordprocessingml/2006/main" xmlns:w14="http://schemas.microsoft.com/office/word/2010/wordml" xmlns:w15="http://schemas.microsoft.com/office/word/2012/wordml" xmlns:w16cex="http://schemas.microsoft.com/office/word/2018/wordml/cex" xmlns:w16cid="http://schemas.microsoft.com/office/word/2016/wordml/cid" xmlns:w16="http://schemas.microsoft.com/office/word/2018/wordml" xmlns:w16du="http://schemas.microsoft.com/office/word/2023/wordml/word16du" xmlns:w16sdtdh="http://schemas.microsoft.com/office/word/2020/wordml/sdtdatahash" xmlns:w16se="http://schemas.microsoft.com/office/word/2015/wordml/symex" xmlns:wpg="http://schemas.microsoft.com/office/word/2010/wordprocessingGroup" xmlns:wpi="http://schemas.microsoft.com/office/word/2010/wordprocessingInk" xmlns:wne="http://schemas.microsoft.com/office/word/2006/wordml" xmlns:wps="http://schemas.microsoft.com/office/word/2010/wordprocessingShape" mc:Ignorable="w14 w15 w16se w16cid w16 w16cex w16sdtdh wp14">
   <w:body>
     <w:p>
       <w:pPr>
@@ -30,6 +30,248 @@
           <w:lang w:val="en-US"/>
         </w:rPr>
         <w:t>Work Notes</w:t>
+      </w:r>
+    </w:p>
+    <w:p>
+      <w:pPr>
+        <w:rPr>
+          <w:lang w:val="en-US"/>
+        </w:rPr>
+      </w:pPr>
+    </w:p>
+    <w:p>
+      <w:pPr>
+        <w:pStyle w:val="Heading2"/>
+        <w:rPr>
+          <w:lang w:val="en-US"/>
+        </w:rPr>
+      </w:pPr>
+      <w:r>
+        <w:rPr>
+          <w:lang w:val="en-US"/>
+        </w:rPr>
+        <w:t>Publish version 1.6.1 – 17/5/2023</w:t>
+      </w:r>
+    </w:p>
+    <w:p>
+      <w:pPr>
+        <w:rPr>
+          <w:lang w:val="en-US"/>
+        </w:rPr>
+      </w:pPr>
+      <w:r>
+        <w:rPr>
+          <w:lang w:val="en-US"/>
+        </w:rPr>
+        <w:t>Mostly about simpler control of bias in all types of images.</w:t>
+      </w:r>
+    </w:p>
+    <w:p>
+      <w:pPr>
+        <w:rPr>
+          <w:lang w:val="en-US"/>
+        </w:rPr>
+      </w:pPr>
+    </w:p>
+    <w:p>
+      <w:pPr>
+        <w:pStyle w:val="Heading2"/>
+        <w:rPr>
+          <w:lang w:val="en-US"/>
+        </w:rPr>
+      </w:pPr>
+      <w:r>
+        <w:rPr>
+          <w:lang w:val="en-US"/>
+        </w:rPr>
+        <w:t>Solve problem with comparing Dicom to Binary images – 10/4/2023</w:t>
+      </w:r>
+    </w:p>
+    <w:p>
+      <w:pPr>
+        <w:rPr>
+          <w:lang w:val="en-US"/>
+        </w:rPr>
+      </w:pPr>
+      <w:r>
+        <w:rPr>
+          <w:lang w:val="en-US"/>
+        </w:rPr>
+        <w:t xml:space="preserve">There is a problem with the common window – </w:t>
+      </w:r>
+    </w:p>
+    <w:p>
+      <w:pPr>
+        <w:rPr>
+          <w:lang w:val="en-US"/>
+        </w:rPr>
+      </w:pPr>
+      <w:r>
+        <w:rPr>
+          <w:lang w:val="en-US"/>
+        </w:rPr>
+        <w:t>Should be good by default.</w:t>
+      </w:r>
+    </w:p>
+    <w:p>
+      <w:pPr>
+        <w:pStyle w:val="Heading4"/>
+        <w:rPr>
+          <w:lang w:val="en-US"/>
+        </w:rPr>
+      </w:pPr>
+      <w:r>
+        <w:rPr>
+          <w:lang w:val="en-US"/>
+        </w:rPr>
+        <w:t>There are many problems…</w:t>
+      </w:r>
+    </w:p>
+    <w:p>
+      <w:pPr>
+        <w:pStyle w:val="ListParagraph"/>
+        <w:numPr>
+          <w:ilvl w:val="0"/>
+          <w:numId w:val="2"/>
+        </w:numPr>
+        <w:rPr>
+          <w:lang w:val="en-US"/>
+        </w:rPr>
+      </w:pPr>
+      <w:r>
+        <w:rPr>
+          <w:lang w:val="en-US"/>
+        </w:rPr>
+        <w:t>All the issue of Bias is not working correctly for the multi-data-file (MDF)</w:t>
+      </w:r>
+    </w:p>
+    <w:p>
+      <w:pPr>
+        <w:pStyle w:val="ListParagraph"/>
+        <w:numPr>
+          <w:ilvl w:val="0"/>
+          <w:numId w:val="2"/>
+        </w:numPr>
+        <w:rPr>
+          <w:lang w:val="en-US"/>
+        </w:rPr>
+      </w:pPr>
+      <w:r>
+        <w:rPr>
+          <w:lang w:val="en-US"/>
+        </w:rPr>
+        <w:t>Dicom and MDF are not leafing together</w:t>
+      </w:r>
+    </w:p>
+    <w:p>
+      <w:pPr>
+        <w:pStyle w:val="ListParagraph"/>
+        <w:numPr>
+          <w:ilvl w:val="0"/>
+          <w:numId w:val="2"/>
+        </w:numPr>
+        <w:rPr>
+          <w:lang w:val="en-US"/>
+        </w:rPr>
+      </w:pPr>
+      <w:r>
+        <w:rPr>
+          <w:lang w:val="en-US"/>
+        </w:rPr>
+        <w:t>Search for best fit page was stuck</w:t>
+      </w:r>
+    </w:p>
+    <w:p>
+      <w:pPr>
+        <w:pStyle w:val="ListParagraph"/>
+        <w:numPr>
+          <w:ilvl w:val="0"/>
+          <w:numId w:val="2"/>
+        </w:numPr>
+        <w:rPr>
+          <w:lang w:val="en-US"/>
+        </w:rPr>
+      </w:pPr>
+      <w:r>
+        <w:rPr>
+          <w:lang w:val="en-US"/>
+        </w:rPr>
+        <w:t>Should be able to set bias from “Image Params Dialog”</w:t>
+      </w:r>
+    </w:p>
+    <w:p>
+      <w:pPr>
+        <w:pStyle w:val="ListParagraph"/>
+        <w:numPr>
+          <w:ilvl w:val="0"/>
+          <w:numId w:val="2"/>
+        </w:numPr>
+        <w:rPr>
+          <w:lang w:val="en-US"/>
+        </w:rPr>
+      </w:pPr>
+      <w:r>
+        <w:rPr>
+          <w:lang w:val="en-US"/>
+        </w:rPr>
+        <w:t>Should be able to set bias from “Settings” menu</w:t>
+      </w:r>
+    </w:p>
+    <w:p>
+      <w:pPr>
+        <w:pStyle w:val="Heading4"/>
+        <w:rPr>
+          <w:lang w:val="en-US"/>
+        </w:rPr>
+      </w:pPr>
+      <w:r>
+        <w:rPr>
+          <w:lang w:val="en-US"/>
+        </w:rPr>
+        <w:t>Reorganize bias SW</w:t>
+      </w:r>
+    </w:p>
+    <w:p>
+      <w:pPr>
+        <w:rPr>
+          <w:lang w:val="en-US"/>
+        </w:rPr>
+      </w:pPr>
+      <w:r>
+        <w:rPr>
+          <w:lang w:val="en-US"/>
+        </w:rPr>
+        <w:t>Only one Bias parameter in “Meta Data Base” class</w:t>
+      </w:r>
+    </w:p>
+    <w:p>
+      <w:pPr>
+        <w:rPr>
+          <w:lang w:val="en-US"/>
+        </w:rPr>
+      </w:pPr>
+      <w:r>
+        <w:rPr>
+          <w:lang w:val="en-US"/>
+        </w:rPr>
+        <w:t>It is “</w:t>
+      </w:r>
+      <w:proofErr w:type="spellStart"/>
+      <w:r>
+        <w:rPr>
+          <w:rFonts w:ascii="Consolas" w:hAnsi="Consolas" w:cs="Consolas"/>
+          <w:color w:val="000000"/>
+          <w:sz w:val="19"/>
+          <w:szCs w:val="19"/>
+        </w:rPr>
+        <w:t>mRescaleIntercept</w:t>
+      </w:r>
+      <w:proofErr w:type="spellEnd"/>
+      <w:r>
+        <w:rPr>
+          <w:lang w:val="en-US"/>
+        </w:rPr>
+        <w:t>”</w:t>
       </w:r>
     </w:p>
     <w:p>
@@ -480,6 +722,7 @@
         <w:rPr>
           <w:lang w:val="en-US"/>
         </w:rPr>
+        <w:lastRenderedPageBreak/>
         <w:t xml:space="preserve">I’m still working on a new version of IQRA – </w:t>
       </w:r>
     </w:p>
@@ -678,434 +921,420 @@
         <w:rPr>
           <w:lang w:val="en-US"/>
         </w:rPr>
+        <w:t>Allow compare (diff) of short and float (and other types) in all modes</w:t>
+      </w:r>
+    </w:p>
+    <w:p>
+      <w:pPr>
+        <w:rPr>
+          <w:lang w:val="en-US"/>
+        </w:rPr>
+      </w:pPr>
+      <w:r>
+        <w:rPr>
+          <w:lang w:val="en-US"/>
+        </w:rPr>
+        <w:t>Fast leafing by loading all files from the disk – especially in multi-files Dicom series</w:t>
+      </w:r>
+    </w:p>
+    <w:p>
+      <w:pPr>
+        <w:rPr>
+          <w:lang w:val="en-US"/>
+        </w:rPr>
+      </w:pPr>
+    </w:p>
+    <w:p>
+      <w:pPr>
+        <w:pStyle w:val="Heading2"/>
+        <w:rPr>
+          <w:lang w:val="en-US"/>
+        </w:rPr>
+      </w:pPr>
+      <w:r>
+        <w:rPr>
+          <w:lang w:val="en-US"/>
+        </w:rPr>
+        <w:t>Design Bug – connect leafing of different files’ types – v1.4.9 – 20/12/21</w:t>
+      </w:r>
+    </w:p>
+    <w:p>
+      <w:pPr>
+        <w:rPr>
+          <w:lang w:val="en-US"/>
+        </w:rPr>
+      </w:pPr>
+      <w:r>
+        <w:rPr>
+          <w:lang w:val="en-US"/>
+        </w:rPr>
+        <w:t xml:space="preserve">When loading side-by-side different file types – </w:t>
+      </w:r>
+    </w:p>
+    <w:p>
+      <w:pPr>
+        <w:rPr>
+          <w:lang w:val="en-US"/>
+        </w:rPr>
+      </w:pPr>
+      <w:r>
+        <w:rPr>
+          <w:lang w:val="en-US"/>
+        </w:rPr>
+        <w:t>The default assumption should be that they should be leafing together.</w:t>
+      </w:r>
+    </w:p>
+    <w:p>
+      <w:pPr>
+        <w:rPr>
+          <w:lang w:val="en-US"/>
+        </w:rPr>
+      </w:pPr>
+      <w:r>
+        <w:rPr>
+          <w:lang w:val="en-US"/>
+        </w:rPr>
+        <w:t xml:space="preserve">And in this opportunity – </w:t>
+      </w:r>
+    </w:p>
+    <w:p>
+      <w:pPr>
+        <w:rPr>
+          <w:lang w:val="en-US"/>
+        </w:rPr>
+      </w:pPr>
+      <w:r>
+        <w:rPr>
+          <w:lang w:val="en-US"/>
+        </w:rPr>
+        <w:t>When jumping to a specific position – or to first or last – also update other positions…</w:t>
+      </w:r>
+    </w:p>
+    <w:p>
+      <w:pPr>
+        <w:pStyle w:val="Heading4"/>
+        <w:rPr>
+          <w:lang w:val="en-US"/>
+        </w:rPr>
+      </w:pPr>
+      <w:r>
+        <w:rPr>
+          <w:lang w:val="en-US"/>
+        </w:rPr>
+        <w:t>Design for solution</w:t>
+      </w:r>
+    </w:p>
+    <w:p>
+      <w:pPr>
+        <w:rPr>
+          <w:lang w:val="en-US"/>
+        </w:rPr>
+      </w:pPr>
+      <w:r>
+        <w:rPr>
+          <w:lang w:val="en-US"/>
+        </w:rPr>
+        <w:t xml:space="preserve">Keep list of position objects – </w:t>
+      </w:r>
+    </w:p>
+    <w:p>
+      <w:pPr>
+        <w:rPr>
+          <w:lang w:val="en-US"/>
+        </w:rPr>
+      </w:pPr>
+      <w:r>
+        <w:rPr>
+          <w:lang w:val="en-US"/>
+        </w:rPr>
+        <w:t>Every object has a “level” in the multi-dimension scheme</w:t>
+      </w:r>
+    </w:p>
+    <w:p>
+      <w:pPr>
+        <w:rPr>
+          <w:lang w:val="en-US"/>
+        </w:rPr>
+      </w:pPr>
+      <w:r>
+        <w:rPr>
+          <w:lang w:val="en-US"/>
+        </w:rPr>
+        <w:t>Global flag for position synchronization</w:t>
+      </w:r>
+    </w:p>
+    <w:p>
+      <w:pPr>
+        <w:rPr>
+          <w:lang w:val="en-US"/>
+        </w:rPr>
+      </w:pPr>
+      <w:r>
+        <w:rPr>
+          <w:lang w:val="en-US"/>
+        </w:rPr>
+        <w:t>If position is set – update all positions of the same level</w:t>
+      </w:r>
+    </w:p>
+    <w:p>
+      <w:pPr>
+        <w:rPr>
+          <w:lang w:val="en-US"/>
+        </w:rPr>
+      </w:pPr>
+      <w:r>
+        <w:rPr>
+          <w:lang w:val="en-US"/>
+        </w:rPr>
+        <w:t xml:space="preserve">Add new class </w:t>
+      </w:r>
+      <w:proofErr w:type="spellStart"/>
+      <w:r>
+        <w:rPr>
+          <w:lang w:val="en-US"/>
+        </w:rPr>
+        <w:t>CPositionSync</w:t>
+      </w:r>
+      <w:proofErr w:type="spellEnd"/>
+    </w:p>
+    <w:p>
+      <w:pPr>
+        <w:pStyle w:val="Heading4"/>
+        <w:rPr>
+          <w:lang w:val="en-US"/>
+        </w:rPr>
+      </w:pPr>
+      <w:r>
+        <w:rPr>
+          <w:lang w:val="en-US"/>
+        </w:rPr>
+        <w:t>Check different scenarios</w:t>
+      </w:r>
+    </w:p>
+    <w:p>
+      <w:pPr>
+        <w:rPr>
+          <w:lang w:val="en-US"/>
+        </w:rPr>
+      </w:pPr>
+      <w:r>
+        <w:rPr>
+          <w:lang w:val="en-US"/>
+        </w:rPr>
+        <w:t>Not every “set current” requires sync…</w:t>
+      </w:r>
+    </w:p>
+    <w:p>
+      <w:pPr>
+        <w:rPr>
+          <w:lang w:val="en-US"/>
+        </w:rPr>
+      </w:pPr>
+      <w:r>
+        <w:rPr>
+          <w:lang w:val="en-US"/>
+        </w:rPr>
+        <w:t>Loading new file should get the position of the previous files…</w:t>
+      </w:r>
+    </w:p>
+    <w:p>
+      <w:pPr>
+        <w:rPr>
+          <w:lang w:val="en-US"/>
+        </w:rPr>
+      </w:pPr>
+      <w:r>
+        <w:rPr>
+          <w:lang w:val="en-US"/>
+        </w:rPr>
+        <w:t>Check combinations of two dimensional files</w:t>
+      </w:r>
+    </w:p>
+    <w:p>
+      <w:pPr>
+        <w:rPr>
+          <w:lang w:val="en-US"/>
+        </w:rPr>
+      </w:pPr>
+      <w:r>
+        <w:rPr>
+          <w:lang w:val="en-US"/>
+        </w:rPr>
+        <w:t>Add “stop sync”</w:t>
+      </w:r>
+    </w:p>
+    <w:p>
+      <w:pPr>
+        <w:rPr>
+          <w:lang w:val="en-US"/>
+        </w:rPr>
+      </w:pPr>
+    </w:p>
+    <w:p>
+      <w:pPr>
+        <w:pStyle w:val="Heading2"/>
+        <w:rPr>
+          <w:lang w:val="en-US"/>
+        </w:rPr>
+      </w:pPr>
+      <w:r>
+        <w:rPr>
+          <w:lang w:val="en-US"/>
+        </w:rPr>
+        <w:t>Resume work of Coronal &amp; Sagittal – v1.4.6 – 31/10/2021</w:t>
+      </w:r>
+    </w:p>
+    <w:p>
+      <w:pPr>
+        <w:rPr>
+          <w:lang w:val="en-US"/>
+        </w:rPr>
+      </w:pPr>
+      <w:r>
+        <w:rPr>
+          <w:lang w:val="en-US"/>
+        </w:rPr>
+        <w:t>There were some bugs due to other changes…</w:t>
+      </w:r>
+    </w:p>
+    <w:p>
+      <w:pPr>
+        <w:rPr>
+          <w:lang w:val="en-US"/>
+        </w:rPr>
+      </w:pPr>
+      <w:r>
+        <w:rPr>
+          <w:lang w:val="en-US"/>
+        </w:rPr>
+        <w:t>Now it seems to be working.</w:t>
+      </w:r>
+    </w:p>
+    <w:p>
+      <w:pPr>
+        <w:rPr>
+          <w:lang w:val="en-US"/>
+        </w:rPr>
+      </w:pPr>
+      <w:r>
+        <w:rPr>
+          <w:lang w:val="en-US"/>
+        </w:rPr>
+        <w:t>V1.4.6 released</w:t>
+      </w:r>
+    </w:p>
+    <w:p>
+      <w:pPr>
+        <w:pStyle w:val="Heading2"/>
+        <w:rPr>
+          <w:lang w:val="en-US"/>
+        </w:rPr>
+      </w:pPr>
+      <w:r>
+        <w:rPr>
+          <w:lang w:val="en-US"/>
+        </w:rPr>
+        <w:t>Adjustment to support client application – 19/10/21</w:t>
+      </w:r>
+    </w:p>
+    <w:p>
+      <w:pPr>
+        <w:rPr>
+          <w:lang w:val="en-US"/>
+        </w:rPr>
+      </w:pPr>
+      <w:r>
+        <w:rPr>
+          <w:lang w:val="en-US"/>
+        </w:rPr>
+        <w:t>Image Quality Review Application has to save ImageR state to wanted file destination…</w:t>
+      </w:r>
+    </w:p>
+    <w:p>
+      <w:pPr>
+        <w:rPr>
+          <w:lang w:val="en-US"/>
+        </w:rPr>
+      </w:pPr>
+    </w:p>
+    <w:p>
+      <w:pPr>
+        <w:pStyle w:val="Heading2"/>
+        <w:rPr>
+          <w:lang w:val="en-US"/>
+        </w:rPr>
+      </w:pPr>
+      <w:r>
+        <w:rPr>
+          <w:lang w:val="en-US"/>
+        </w:rPr>
+        <w:t>Add recent files support in menus 20/7/21</w:t>
+      </w:r>
+    </w:p>
+    <w:p>
+      <w:pPr>
+        <w:rPr>
+          <w:lang w:val="en-US"/>
+        </w:rPr>
+      </w:pPr>
+      <w:r>
+        <w:rPr>
+          <w:lang w:val="en-US"/>
+        </w:rPr>
+        <w:t>Save the recent files’ list in a text file near the application.</w:t>
+      </w:r>
+    </w:p>
+    <w:p>
+      <w:pPr>
+        <w:rPr>
+          <w:lang w:val="en-US"/>
+        </w:rPr>
+      </w:pPr>
+      <w:r>
+        <w:rPr>
+          <w:lang w:val="en-US"/>
+        </w:rPr>
+        <w:t>It seems to be working – commit version 1.4.1</w:t>
+      </w:r>
+    </w:p>
+    <w:p>
+      <w:pPr>
+        <w:rPr>
+          <w:lang w:val="en-US"/>
+        </w:rPr>
+      </w:pPr>
+      <w:r>
+        <w:rPr>
+          <w:lang w:val="en-US"/>
+        </w:rPr>
+        <w:t>Add different recent files for &lt;File&gt; and &lt;Add&gt; menus</w:t>
+      </w:r>
+      <w:r>
+        <w:rPr>
+          <w:lang w:val="en-US"/>
+        </w:rPr>
+        <w:t xml:space="preserve"> - later</w:t>
+      </w:r>
+    </w:p>
+    <w:p>
+      <w:pPr>
+        <w:rPr>
+          <w:lang w:val="en-US"/>
+        </w:rPr>
+      </w:pPr>
+    </w:p>
+    <w:p>
+      <w:pPr>
+        <w:pStyle w:val="Heading2"/>
+        <w:rPr>
+          <w:lang w:val="en-US"/>
+        </w:rPr>
+      </w:pPr>
+      <w:r>
+        <w:rPr>
+          <w:lang w:val="en-US"/>
+        </w:rPr>
         <w:lastRenderedPageBreak/>
-        <w:t>Allow compare (diff) of short and float (and other types) in all modes</w:t>
-      </w:r>
-    </w:p>
-    <w:p>
-      <w:pPr>
-        <w:rPr>
-          <w:lang w:val="en-US"/>
-        </w:rPr>
-      </w:pPr>
-      <w:r>
-        <w:rPr>
-          <w:lang w:val="en-US"/>
-        </w:rPr>
-        <w:t>Fast leafing by loading all files from the disk – especially in multi-files Dicom series</w:t>
-      </w:r>
-    </w:p>
-    <w:p>
-      <w:pPr>
-        <w:rPr>
-          <w:lang w:val="en-US"/>
-        </w:rPr>
-      </w:pPr>
-    </w:p>
-    <w:p>
-      <w:pPr>
-        <w:pStyle w:val="Heading2"/>
-        <w:rPr>
-          <w:lang w:val="en-US"/>
-        </w:rPr>
-      </w:pPr>
-      <w:r>
-        <w:rPr>
-          <w:lang w:val="en-US"/>
-        </w:rPr>
-        <w:t>Design Bug – connect leafing of different files’ types – v1.4.9 – 20/12/21</w:t>
-      </w:r>
-    </w:p>
-    <w:p>
-      <w:pPr>
-        <w:rPr>
-          <w:lang w:val="en-US"/>
-        </w:rPr>
-      </w:pPr>
-      <w:r>
-        <w:rPr>
-          <w:lang w:val="en-US"/>
-        </w:rPr>
-        <w:t xml:space="preserve">When loading side-by-side different file types – </w:t>
-      </w:r>
-    </w:p>
-    <w:p>
-      <w:pPr>
-        <w:rPr>
-          <w:lang w:val="en-US"/>
-        </w:rPr>
-      </w:pPr>
-      <w:r>
-        <w:rPr>
-          <w:lang w:val="en-US"/>
-        </w:rPr>
-        <w:t>The default assumption should be that they should be leafing together.</w:t>
-      </w:r>
-    </w:p>
-    <w:p>
-      <w:pPr>
-        <w:rPr>
-          <w:lang w:val="en-US"/>
-        </w:rPr>
-      </w:pPr>
-      <w:r>
-        <w:rPr>
-          <w:lang w:val="en-US"/>
-        </w:rPr>
-        <w:t xml:space="preserve">And in this opportunity – </w:t>
-      </w:r>
-    </w:p>
-    <w:p>
-      <w:pPr>
-        <w:rPr>
-          <w:lang w:val="en-US"/>
-        </w:rPr>
-      </w:pPr>
-      <w:r>
-        <w:rPr>
-          <w:lang w:val="en-US"/>
-        </w:rPr>
-        <w:t>When jumping to a specific position – or to first or last – also update other positions…</w:t>
-      </w:r>
-    </w:p>
-    <w:p>
-      <w:pPr>
-        <w:pStyle w:val="Heading4"/>
-        <w:rPr>
-          <w:lang w:val="en-US"/>
-        </w:rPr>
-      </w:pPr>
-      <w:r>
-        <w:rPr>
-          <w:lang w:val="en-US"/>
-        </w:rPr>
-        <w:t>Design for solution</w:t>
-      </w:r>
-    </w:p>
-    <w:p>
-      <w:pPr>
-        <w:rPr>
-          <w:lang w:val="en-US"/>
-        </w:rPr>
-      </w:pPr>
-      <w:r>
-        <w:rPr>
-          <w:lang w:val="en-US"/>
-        </w:rPr>
-        <w:t xml:space="preserve">Keep list of position objects – </w:t>
-      </w:r>
-    </w:p>
-    <w:p>
-      <w:pPr>
-        <w:rPr>
-          <w:lang w:val="en-US"/>
-        </w:rPr>
-      </w:pPr>
-      <w:r>
-        <w:rPr>
-          <w:lang w:val="en-US"/>
-        </w:rPr>
-        <w:t>Every object has a “level” in the multi-dimension scheme</w:t>
-      </w:r>
-    </w:p>
-    <w:p>
-      <w:pPr>
-        <w:rPr>
-          <w:lang w:val="en-US"/>
-        </w:rPr>
-      </w:pPr>
-      <w:r>
-        <w:rPr>
-          <w:lang w:val="en-US"/>
-        </w:rPr>
-        <w:t>Global flag for position synchronization</w:t>
-      </w:r>
-    </w:p>
-    <w:p>
-      <w:pPr>
-        <w:rPr>
-          <w:lang w:val="en-US"/>
-        </w:rPr>
-      </w:pPr>
-      <w:r>
-        <w:rPr>
-          <w:lang w:val="en-US"/>
-        </w:rPr>
-        <w:t>If position is set – update all positions of the same level</w:t>
-      </w:r>
-    </w:p>
-    <w:p>
-      <w:pPr>
-        <w:rPr>
-          <w:lang w:val="en-US"/>
-        </w:rPr>
-      </w:pPr>
-      <w:r>
-        <w:rPr>
-          <w:lang w:val="en-US"/>
-        </w:rPr>
-        <w:t xml:space="preserve">Add new class </w:t>
-      </w:r>
-      <w:proofErr w:type="spellStart"/>
-      <w:r>
-        <w:rPr>
-          <w:lang w:val="en-US"/>
-        </w:rPr>
-        <w:t>CPositionSync</w:t>
-      </w:r>
-      <w:proofErr w:type="spellEnd"/>
-    </w:p>
-    <w:p>
-      <w:pPr>
-        <w:pStyle w:val="Heading4"/>
-        <w:rPr>
-          <w:lang w:val="en-US"/>
-        </w:rPr>
-      </w:pPr>
-      <w:r>
-        <w:rPr>
-          <w:lang w:val="en-US"/>
-        </w:rPr>
-        <w:t>Check different scenarios</w:t>
-      </w:r>
-    </w:p>
-    <w:p>
-      <w:pPr>
-        <w:rPr>
-          <w:lang w:val="en-US"/>
-        </w:rPr>
-      </w:pPr>
-      <w:r>
-        <w:rPr>
-          <w:lang w:val="en-US"/>
-        </w:rPr>
-        <w:t>Not every “set current” requires sync…</w:t>
-      </w:r>
-    </w:p>
-    <w:p>
-      <w:pPr>
-        <w:rPr>
-          <w:lang w:val="en-US"/>
-        </w:rPr>
-      </w:pPr>
-      <w:r>
-        <w:rPr>
-          <w:lang w:val="en-US"/>
-        </w:rPr>
-        <w:t>Loading new file should get the position of the previous files…</w:t>
-      </w:r>
-    </w:p>
-    <w:p>
-      <w:pPr>
-        <w:rPr>
-          <w:lang w:val="en-US"/>
-        </w:rPr>
-      </w:pPr>
-      <w:r>
-        <w:rPr>
-          <w:lang w:val="en-US"/>
-        </w:rPr>
-        <w:t xml:space="preserve">Check combinations of </w:t>
-      </w:r>
-      <w:proofErr w:type="gramStart"/>
-      <w:r>
-        <w:rPr>
-          <w:lang w:val="en-US"/>
-        </w:rPr>
-        <w:t>two dimensional</w:t>
-      </w:r>
-      <w:proofErr w:type="gramEnd"/>
-      <w:r>
-        <w:rPr>
-          <w:lang w:val="en-US"/>
-        </w:rPr>
-        <w:t xml:space="preserve"> files</w:t>
-      </w:r>
-    </w:p>
-    <w:p>
-      <w:pPr>
-        <w:rPr>
-          <w:lang w:val="en-US"/>
-        </w:rPr>
-      </w:pPr>
-      <w:r>
-        <w:rPr>
-          <w:lang w:val="en-US"/>
-        </w:rPr>
-        <w:t>Add “stop sync”</w:t>
-      </w:r>
-    </w:p>
-    <w:p>
-      <w:pPr>
-        <w:rPr>
-          <w:lang w:val="en-US"/>
-        </w:rPr>
-      </w:pPr>
-    </w:p>
-    <w:p>
-      <w:pPr>
-        <w:pStyle w:val="Heading2"/>
-        <w:rPr>
-          <w:lang w:val="en-US"/>
-        </w:rPr>
-      </w:pPr>
-      <w:r>
-        <w:rPr>
-          <w:lang w:val="en-US"/>
-        </w:rPr>
-        <w:t>Resume work of Coronal &amp; Sagittal – v1.4.6 – 31/10/2021</w:t>
-      </w:r>
-    </w:p>
-    <w:p>
-      <w:pPr>
-        <w:rPr>
-          <w:lang w:val="en-US"/>
-        </w:rPr>
-      </w:pPr>
-      <w:r>
-        <w:rPr>
-          <w:lang w:val="en-US"/>
-        </w:rPr>
-        <w:t>There were some bugs due to other changes…</w:t>
-      </w:r>
-    </w:p>
-    <w:p>
-      <w:pPr>
-        <w:rPr>
-          <w:lang w:val="en-US"/>
-        </w:rPr>
-      </w:pPr>
-      <w:r>
-        <w:rPr>
-          <w:lang w:val="en-US"/>
-        </w:rPr>
-        <w:t>Now it seems to be working.</w:t>
-      </w:r>
-    </w:p>
-    <w:p>
-      <w:pPr>
-        <w:rPr>
-          <w:lang w:val="en-US"/>
-        </w:rPr>
-      </w:pPr>
-      <w:r>
-        <w:rPr>
-          <w:lang w:val="en-US"/>
-        </w:rPr>
-        <w:t>V1.4.6 released</w:t>
-      </w:r>
-    </w:p>
-    <w:p>
-      <w:pPr>
-        <w:pStyle w:val="Heading2"/>
-        <w:rPr>
-          <w:lang w:val="en-US"/>
-        </w:rPr>
-      </w:pPr>
-      <w:r>
-        <w:rPr>
-          <w:lang w:val="en-US"/>
-        </w:rPr>
-        <w:t>Adjustment to support client application – 19/10/21</w:t>
-      </w:r>
-    </w:p>
-    <w:p>
-      <w:pPr>
-        <w:rPr>
-          <w:lang w:val="en-US"/>
-        </w:rPr>
-      </w:pPr>
-      <w:r>
-        <w:rPr>
-          <w:lang w:val="en-US"/>
-        </w:rPr>
-        <w:t>Image Quality Review Application has to save ImageR state to wanted file destination…</w:t>
-      </w:r>
-    </w:p>
-    <w:p>
-      <w:pPr>
-        <w:rPr>
-          <w:lang w:val="en-US"/>
-        </w:rPr>
-      </w:pPr>
-    </w:p>
-    <w:p>
-      <w:pPr>
-        <w:pStyle w:val="Heading2"/>
-        <w:rPr>
-          <w:lang w:val="en-US"/>
-        </w:rPr>
-      </w:pPr>
-      <w:r>
-        <w:rPr>
-          <w:lang w:val="en-US"/>
-        </w:rPr>
-        <w:t>Add recent files support in menus 20/7/21</w:t>
-      </w:r>
-    </w:p>
-    <w:p>
-      <w:pPr>
-        <w:rPr>
-          <w:lang w:val="en-US"/>
-        </w:rPr>
-      </w:pPr>
-      <w:r>
-        <w:rPr>
-          <w:lang w:val="en-US"/>
-        </w:rPr>
-        <w:t>Save the recent files’ list in a text file near the application.</w:t>
-      </w:r>
-    </w:p>
-    <w:p>
-      <w:pPr>
-        <w:rPr>
-          <w:lang w:val="en-US"/>
-        </w:rPr>
-      </w:pPr>
-      <w:r>
-        <w:rPr>
-          <w:lang w:val="en-US"/>
-        </w:rPr>
-        <w:t>It seems to be working – commit version 1.4.1</w:t>
-      </w:r>
-    </w:p>
-    <w:p>
-      <w:pPr>
-        <w:rPr>
-          <w:lang w:val="en-US"/>
-        </w:rPr>
-      </w:pPr>
-      <w:r>
-        <w:rPr>
-          <w:lang w:val="en-US"/>
-        </w:rPr>
-        <w:t>Add different recent files for &lt;File&gt; and &lt;Add&gt; menus</w:t>
-      </w:r>
-      <w:r>
-        <w:rPr>
-          <w:lang w:val="en-US"/>
-        </w:rPr>
-        <w:t xml:space="preserve"> - later</w:t>
-      </w:r>
-    </w:p>
-    <w:p>
-      <w:pPr>
-        <w:rPr>
-          <w:lang w:val="en-US"/>
-        </w:rPr>
-      </w:pPr>
-    </w:p>
-    <w:p>
-      <w:pPr>
-        <w:pStyle w:val="Heading2"/>
-        <w:rPr>
-          <w:lang w:val="en-US"/>
-        </w:rPr>
-      </w:pPr>
-      <w:r>
-        <w:rPr>
-          <w:lang w:val="en-US"/>
-        </w:rPr>
         <w:t>Create Dicom Files with any raster – 17-18/7/21</w:t>
       </w:r>
     </w:p>
@@ -1250,25 +1479,24 @@
           <w:szCs w:val="18"/>
           <w:lang w:val="en-US"/>
         </w:rPr>
-        <w:t xml:space="preserve">  1 at 00000084:  G 0028 N </w:t>
-      </w:r>
-      <w:proofErr w:type="gramStart"/>
-      <w:r>
+        <w:t xml:space="preserve">  1 at 00000084:  G 0028 N 0010  Len        2 L    s 0x 08</w:t>
+      </w:r>
+    </w:p>
+    <w:p>
+      <w:pPr>
         <w:rPr>
           <w:sz w:val="18"/>
           <w:szCs w:val="18"/>
           <w:lang w:val="en-US"/>
         </w:rPr>
-        <w:t>0010  Len</w:t>
-      </w:r>
-      <w:proofErr w:type="gramEnd"/>
+      </w:pPr>
       <w:r>
         <w:rPr>
           <w:sz w:val="18"/>
           <w:szCs w:val="18"/>
           <w:lang w:val="en-US"/>
         </w:rPr>
-        <w:t xml:space="preserve">        2 L    s 0x 08</w:t>
+        <w:t xml:space="preserve">  2 at 0000008e:  G 0028 N 0011  Len        2 L     0x 86 08</w:t>
       </w:r>
     </w:p>
     <w:p>
@@ -1285,60 +1513,7 @@
           <w:szCs w:val="18"/>
           <w:lang w:val="en-US"/>
         </w:rPr>
-        <w:t xml:space="preserve">  2 at 0000008e:  G 0028 N </w:t>
-      </w:r>
-      <w:proofErr w:type="gramStart"/>
-      <w:r>
-        <w:rPr>
-          <w:sz w:val="18"/>
-          <w:szCs w:val="18"/>
-          <w:lang w:val="en-US"/>
-        </w:rPr>
-        <w:t>0011  Len</w:t>
-      </w:r>
-      <w:proofErr w:type="gramEnd"/>
-      <w:r>
-        <w:rPr>
-          <w:sz w:val="18"/>
-          <w:szCs w:val="18"/>
-          <w:lang w:val="en-US"/>
-        </w:rPr>
-        <w:t xml:space="preserve">        2 L     0x 86 08</w:t>
-      </w:r>
-    </w:p>
-    <w:p>
-      <w:pPr>
-        <w:rPr>
-          <w:sz w:val="18"/>
-          <w:szCs w:val="18"/>
-          <w:lang w:val="en-US"/>
-        </w:rPr>
-      </w:pPr>
-      <w:r>
-        <w:rPr>
-          <w:sz w:val="18"/>
-          <w:szCs w:val="18"/>
-          <w:lang w:val="en-US"/>
-        </w:rPr>
-        <w:t xml:space="preserve">  3 at 00000098:  G 7fe0 N </w:t>
-      </w:r>
-      <w:proofErr w:type="gramStart"/>
-      <w:r>
-        <w:rPr>
-          <w:sz w:val="18"/>
-          <w:szCs w:val="18"/>
-          <w:lang w:val="en-US"/>
-        </w:rPr>
-        <w:t>0010  Len</w:t>
-      </w:r>
-      <w:proofErr w:type="gramEnd"/>
-      <w:r>
-        <w:rPr>
-          <w:sz w:val="18"/>
-          <w:szCs w:val="18"/>
-          <w:lang w:val="en-US"/>
-        </w:rPr>
-        <w:t xml:space="preserve">  9439332 L     0x 00 00 bb 03 e6 03 c1 03 </w:t>
+        <w:t xml:space="preserve">  3 at 00000098:  G 7fe0 N 0010  Len  9439332 L     0x 00 00 bb 03 e6 03 c1 03 </w:t>
       </w:r>
       <w:proofErr w:type="spellStart"/>
       <w:r>
@@ -1403,7 +1578,7 @@
 </file>
 
 <file path=word/numbering.xml><?xml version="1.0" encoding="utf-8"?>
-<w:numbering xmlns:wpc="http://schemas.microsoft.com/office/word/2010/wordprocessingCanvas" xmlns:cx="http://schemas.microsoft.com/office/drawing/2014/chartex" xmlns:cx1="http://schemas.microsoft.com/office/drawing/2015/9/8/chartex" xmlns:cx2="http://schemas.microsoft.com/office/drawing/2015/10/21/chartex" xmlns:cx3="http://schemas.microsoft.com/office/drawing/2016/5/9/chartex" xmlns:cx4="http://schemas.microsoft.com/office/drawing/2016/5/10/chartex" xmlns:cx5="http://schemas.microsoft.com/office/drawing/2016/5/11/chartex" xmlns:cx6="http://schemas.microsoft.com/office/drawing/2016/5/12/chartex" xmlns:cx7="http://schemas.microsoft.com/office/drawing/2016/5/13/chartex" xmlns:cx8="http://schemas.microsoft.com/office/drawing/2016/5/14/chartex" xmlns:mc="http://schemas.openxmlformats.org/markup-compatibility/2006" xmlns:aink="http://schemas.microsoft.com/office/drawing/2016/ink" xmlns:am3d="http://schemas.microsoft.com/office/drawing/2017/model3d" xmlns:o="urn:schemas-microsoft-com:office:office" xmlns:oel="http://schemas.microsoft.com/office/2019/extlst" xmlns:r="http://schemas.openxmlformats.org/officeDocument/2006/relationships" xmlns:m="http://schemas.openxmlformats.org/officeDocument/2006/math" xmlns:v="urn:schemas-microsoft-com:vml" xmlns:wp14="http://schemas.microsoft.com/office/word/2010/wordprocessingDrawing" xmlns:wp="http://schemas.openxmlformats.org/drawingml/2006/wordprocessingDrawing" xmlns:w10="urn:schemas-microsoft-com:office:word" xmlns:w="http://schemas.openxmlformats.org/wordprocessingml/2006/main" xmlns:w14="http://schemas.microsoft.com/office/word/2010/wordml" xmlns:w15="http://schemas.microsoft.com/office/word/2012/wordml" xmlns:w16cex="http://schemas.microsoft.com/office/word/2018/wordml/cex" xmlns:w16cid="http://schemas.microsoft.com/office/word/2016/wordml/cid" xmlns:w16="http://schemas.microsoft.com/office/word/2018/wordml" xmlns:w16sdtdh="http://schemas.microsoft.com/office/word/2020/wordml/sdtdatahash" xmlns:w16se="http://schemas.microsoft.com/office/word/2015/wordml/symex" xmlns:wpg="http://schemas.microsoft.com/office/word/2010/wordprocessingGroup" xmlns:wpi="http://schemas.microsoft.com/office/word/2010/wordprocessingInk" xmlns:wne="http://schemas.microsoft.com/office/word/2006/wordml" xmlns:wps="http://schemas.microsoft.com/office/word/2010/wordprocessingShape" mc:Ignorable="w14 w15 w16se w16cid w16 w16cex w16sdtdh wp14">
+<w:numbering xmlns:wpc="http://schemas.microsoft.com/office/word/2010/wordprocessingCanvas" xmlns:cx="http://schemas.microsoft.com/office/drawing/2014/chartex" xmlns:cx1="http://schemas.microsoft.com/office/drawing/2015/9/8/chartex" xmlns:cx2="http://schemas.microsoft.com/office/drawing/2015/10/21/chartex" xmlns:cx3="http://schemas.microsoft.com/office/drawing/2016/5/9/chartex" xmlns:cx4="http://schemas.microsoft.com/office/drawing/2016/5/10/chartex" xmlns:cx5="http://schemas.microsoft.com/office/drawing/2016/5/11/chartex" xmlns:cx6="http://schemas.microsoft.com/office/drawing/2016/5/12/chartex" xmlns:cx7="http://schemas.microsoft.com/office/drawing/2016/5/13/chartex" xmlns:cx8="http://schemas.microsoft.com/office/drawing/2016/5/14/chartex" xmlns:mc="http://schemas.openxmlformats.org/markup-compatibility/2006" xmlns:aink="http://schemas.microsoft.com/office/drawing/2016/ink" xmlns:am3d="http://schemas.microsoft.com/office/drawing/2017/model3d" xmlns:o="urn:schemas-microsoft-com:office:office" xmlns:oel="http://schemas.microsoft.com/office/2019/extlst" xmlns:r="http://schemas.openxmlformats.org/officeDocument/2006/relationships" xmlns:m="http://schemas.openxmlformats.org/officeDocument/2006/math" xmlns:v="urn:schemas-microsoft-com:vml" xmlns:wp14="http://schemas.microsoft.com/office/word/2010/wordprocessingDrawing" xmlns:wp="http://schemas.openxmlformats.org/drawingml/2006/wordprocessingDrawing" xmlns:w10="urn:schemas-microsoft-com:office:word" xmlns:w="http://schemas.openxmlformats.org/wordprocessingml/2006/main" xmlns:w14="http://schemas.microsoft.com/office/word/2010/wordml" xmlns:w15="http://schemas.microsoft.com/office/word/2012/wordml" xmlns:w16cex="http://schemas.microsoft.com/office/word/2018/wordml/cex" xmlns:w16cid="http://schemas.microsoft.com/office/word/2016/wordml/cid" xmlns:w16="http://schemas.microsoft.com/office/word/2018/wordml" xmlns:w16du="http://schemas.microsoft.com/office/word/2023/wordml/word16du" xmlns:w16sdtdh="http://schemas.microsoft.com/office/word/2020/wordml/sdtdatahash" xmlns:w16se="http://schemas.microsoft.com/office/word/2015/wordml/symex" xmlns:wpg="http://schemas.microsoft.com/office/word/2010/wordprocessingGroup" xmlns:wpi="http://schemas.microsoft.com/office/word/2010/wordprocessingInk" xmlns:wne="http://schemas.microsoft.com/office/word/2006/wordml" xmlns:wps="http://schemas.microsoft.com/office/word/2010/wordprocessingShape" mc:Ignorable="w14 w15 w16se w16cid w16 w16cex w16sdtdh wp14">
   <w:abstractNum w:abstractNumId="0" w15:restartNumberingAfterBreak="0">
     <w:nsid w:val="2DDB6DAF"/>
     <w:multiLevelType w:val="hybridMultilevel"/>
@@ -1493,8 +1668,100 @@
       </w:pPr>
     </w:lvl>
   </w:abstractNum>
+  <w:abstractNum w:abstractNumId="1" w15:restartNumberingAfterBreak="0">
+    <w:nsid w:val="6D9C5573"/>
+    <w:multiLevelType w:val="hybridMultilevel"/>
+    <w:tmpl w:val="D3248A3E"/>
+    <w:lvl w:ilvl="0" w:tplc="20000011">
+      <w:start w:val="1"/>
+      <w:numFmt w:val="decimal"/>
+      <w:lvlText w:val="%1)"/>
+      <w:lvlJc w:val="left"/>
+      <w:pPr>
+        <w:ind w:left="720" w:hanging="360"/>
+      </w:pPr>
+      <w:rPr>
+        <w:rFonts w:hint="default"/>
+      </w:rPr>
+    </w:lvl>
+    <w:lvl w:ilvl="1" w:tplc="20000019" w:tentative="1">
+      <w:start w:val="1"/>
+      <w:numFmt w:val="lowerLetter"/>
+      <w:lvlText w:val="%2."/>
+      <w:lvlJc w:val="left"/>
+      <w:pPr>
+        <w:ind w:left="1440" w:hanging="360"/>
+      </w:pPr>
+    </w:lvl>
+    <w:lvl w:ilvl="2" w:tplc="2000001B" w:tentative="1">
+      <w:start w:val="1"/>
+      <w:numFmt w:val="lowerRoman"/>
+      <w:lvlText w:val="%3."/>
+      <w:lvlJc w:val="right"/>
+      <w:pPr>
+        <w:ind w:left="2160" w:hanging="180"/>
+      </w:pPr>
+    </w:lvl>
+    <w:lvl w:ilvl="3" w:tplc="2000000F" w:tentative="1">
+      <w:start w:val="1"/>
+      <w:numFmt w:val="decimal"/>
+      <w:lvlText w:val="%4."/>
+      <w:lvlJc w:val="left"/>
+      <w:pPr>
+        <w:ind w:left="2880" w:hanging="360"/>
+      </w:pPr>
+    </w:lvl>
+    <w:lvl w:ilvl="4" w:tplc="20000019" w:tentative="1">
+      <w:start w:val="1"/>
+      <w:numFmt w:val="lowerLetter"/>
+      <w:lvlText w:val="%5."/>
+      <w:lvlJc w:val="left"/>
+      <w:pPr>
+        <w:ind w:left="3600" w:hanging="360"/>
+      </w:pPr>
+    </w:lvl>
+    <w:lvl w:ilvl="5" w:tplc="2000001B" w:tentative="1">
+      <w:start w:val="1"/>
+      <w:numFmt w:val="lowerRoman"/>
+      <w:lvlText w:val="%6."/>
+      <w:lvlJc w:val="right"/>
+      <w:pPr>
+        <w:ind w:left="4320" w:hanging="180"/>
+      </w:pPr>
+    </w:lvl>
+    <w:lvl w:ilvl="6" w:tplc="2000000F" w:tentative="1">
+      <w:start w:val="1"/>
+      <w:numFmt w:val="decimal"/>
+      <w:lvlText w:val="%7."/>
+      <w:lvlJc w:val="left"/>
+      <w:pPr>
+        <w:ind w:left="5040" w:hanging="360"/>
+      </w:pPr>
+    </w:lvl>
+    <w:lvl w:ilvl="7" w:tplc="20000019" w:tentative="1">
+      <w:start w:val="1"/>
+      <w:numFmt w:val="lowerLetter"/>
+      <w:lvlText w:val="%8."/>
+      <w:lvlJc w:val="left"/>
+      <w:pPr>
+        <w:ind w:left="5760" w:hanging="360"/>
+      </w:pPr>
+    </w:lvl>
+    <w:lvl w:ilvl="8" w:tplc="2000001B" w:tentative="1">
+      <w:start w:val="1"/>
+      <w:numFmt w:val="lowerRoman"/>
+      <w:lvlText w:val="%9."/>
+      <w:lvlJc w:val="right"/>
+      <w:pPr>
+        <w:ind w:left="6480" w:hanging="180"/>
+      </w:pPr>
+    </w:lvl>
+  </w:abstractNum>
   <w:num w:numId="1" w16cid:durableId="1474442835">
     <w:abstractNumId w:val="0"/>
+  </w:num>
+  <w:num w:numId="2" w16cid:durableId="2129081589">
+    <w:abstractNumId w:val="1"/>
   </w:num>
 </w:numbering>
 </file>

</xml_diff>